<commit_message>
feat: ship pending refactor (AI/planning/PDF/compliance services), add active docxtemplater templates, clean debug scripts
Includes the ~3000-line refactor that had been sitting uncommitted on the
production server since March 2026, plus the 13 active docxtemplater
report templates that were never version-controlled. Rebuilt and
smoke-tested dist/ before deploying; PM2 reconfigured to run the
compiled build instead of ts-node dev mode (root cause of historical
crash-restart loop).
</commit_message>
<xml_diff>
--- a/server/templates/reports/FO-PO-PSM-64-08 FORMATO PARA LA ELABORACIÓN DE INFORME TÉCNICO DE AGUA SUBTERRÁNEA-plantilla.docx
+++ b/server/templates/reports/FO-PO-PSM-64-08 FORMATO PARA LA ELABORACIÓN DE INFORME TÉCNICO DE AGUA SUBTERRÁNEA-plantilla.docx
@@ -26,7 +26,7 @@
           <w:szCs w:val="32"/>
           <w:lang w:val="es-CO"/>
         </w:rPr>
-        <w:t xml:space="preserve">INFORME TÉCNICO DE ESTUDIO DE </w:t>
+        <w:t>INFORME TÉCNICO DE ESTUDIO DE </w:t>
       </w:r>
       <w:commentRangeStart w:id="1"/>
       <w:commentRangeStart w:id="2"/>
@@ -70,7 +70,7 @@
           <w:szCs w:val="32"/>
           <w:lang w:val="es-CO"/>
         </w:rPr>
-        <w:t xml:space="preserve"> DE AGUA </w:t>
+        <w:t> DE AGUA </w:t>
       </w:r>
       <w:r>
         <w:rPr>
@@ -79,7 +79,6 @@
           <w:color w:val="303030"/>
           <w:sz w:val="32"/>
           <w:szCs w:val="32"/>
-          <w:highlight w:val="cyan"/>
           <w:lang w:val="es-CO"/>
         </w:rPr>
         <w:t>{informe_tecnico_de_estudio_de_caracterizacion_de_a_1}</w:t>
@@ -91,7 +90,6 @@
           <w:color w:val="303030"/>
           <w:sz w:val="32"/>
           <w:szCs w:val="32"/>
-          <w:highlight w:val="cyan"/>
           <w:lang w:val="es-CO"/>
         </w:rPr>
       </w:r>
@@ -102,7 +100,6 @@
           <w:color w:val="303030"/>
           <w:sz w:val="32"/>
           <w:szCs w:val="32"/>
-          <w:highlight w:val="cyan"/>
           <w:lang w:val="es-CO"/>
         </w:rPr>
       </w:r>
@@ -203,7 +200,6 @@
           <w:color w:val="303030"/>
           <w:sz w:val="56"/>
           <w:szCs w:val="56"/>
-          <w:highlight w:val="cyan"/>
         </w:rPr>
         <w:t>{var_1}</w:t>
       </w:r>
@@ -316,7 +312,7 @@
           <w:szCs w:val="28"/>
           <w:lang w:val="es-CO"/>
         </w:rPr>
-        <w:t xml:space="preserve"> </w:t>
+        <w:t> </w:t>
       </w:r>
       <w:r>
         <w:rPr>
@@ -326,7 +322,6 @@
           <w:color w:val="303030"/>
           <w:sz w:val="28"/>
           <w:szCs w:val="28"/>
-          <w:highlight w:val="cyan"/>
           <w:lang w:val="es-CO"/>
         </w:rPr>
         <w:t>{estudio_de_caracterizacion_1}</w:t>
@@ -339,7 +334,6 @@
           <w:color w:val="303030"/>
           <w:sz w:val="28"/>
           <w:szCs w:val="28"/>
-          <w:highlight w:val="cyan"/>
           <w:lang w:val="es-CO"/>
         </w:rPr>
       </w:r>
@@ -352,7 +346,6 @@
           <w:color w:val="303030"/>
           <w:sz w:val="28"/>
           <w:szCs w:val="28"/>
-          <w:highlight w:val="cyan"/>
           <w:lang w:val="es-CO"/>
         </w:rPr>
       </w:r>
@@ -377,7 +370,7 @@
           <w:szCs w:val="28"/>
           <w:lang w:val="es-CO"/>
         </w:rPr>
-        <w:t xml:space="preserve"> </w:t>
+        <w:t> </w:t>
       </w:r>
       <w:r>
         <w:rPr>
@@ -401,7 +394,7 @@
           <w:szCs w:val="28"/>
           <w:lang w:val="es-CO"/>
         </w:rPr>
-        <w:t xml:space="preserve"> </w:t>
+        <w:t> </w:t>
       </w:r>
       <w:r>
         <w:rPr>
@@ -411,7 +404,6 @@
           <w:color w:val="303030"/>
           <w:sz w:val="28"/>
           <w:szCs w:val="28"/>
-          <w:highlight w:val="cyan"/>
           <w:lang w:val="es-CO"/>
         </w:rPr>
         <w:t>{var_2}</w:t>
@@ -424,7 +416,6 @@
           <w:color w:val="303030"/>
           <w:sz w:val="28"/>
           <w:szCs w:val="28"/>
-          <w:highlight w:val="cyan"/>
           <w:lang w:val="es-CO"/>
         </w:rPr>
       </w:r>
@@ -438,7 +429,7 @@
           <w:szCs w:val="28"/>
           <w:lang w:val="es-CO"/>
         </w:rPr>
-        <w:t xml:space="preserve"> realizada </w:t>
+        <w:t> realizada </w:t>
       </w:r>
       <w:r>
         <w:rPr>
@@ -462,7 +453,7 @@
           <w:szCs w:val="28"/>
           <w:lang w:val="es-CO"/>
         </w:rPr>
-        <w:t xml:space="preserve"> día </w:t>
+        <w:t> día </w:t>
       </w:r>
       <w:r>
         <w:rPr>
@@ -472,7 +463,6 @@
           <w:color w:val="303030"/>
           <w:sz w:val="28"/>
           <w:szCs w:val="28"/>
-          <w:highlight w:val="cyan"/>
           <w:lang w:val="es-CO"/>
         </w:rPr>
         <w:t>{realizada_el_dia_1}</w:t>
@@ -487,7 +477,7 @@
           <w:szCs w:val="28"/>
           <w:lang w:val="es-CO"/>
         </w:rPr>
-        <w:t xml:space="preserve"> de </w:t>
+        <w:t> de </w:t>
       </w:r>
       <w:r>
         <w:rPr>
@@ -497,7 +487,6 @@
           <w:color w:val="303030"/>
           <w:sz w:val="28"/>
           <w:szCs w:val="28"/>
-          <w:highlight w:val="cyan"/>
           <w:lang w:val="es-CO"/>
         </w:rPr>
         <w:t>{realizada_el_dia_de_1}</w:t>
@@ -512,7 +501,7 @@
           <w:szCs w:val="28"/>
           <w:lang w:val="es-CO"/>
         </w:rPr>
-        <w:t xml:space="preserve"> del </w:t>
+        <w:t> del </w:t>
       </w:r>
       <w:r>
         <w:rPr>
@@ -524,7 +513,7 @@
           <w:szCs w:val="28"/>
           <w:lang w:val="es-CO"/>
         </w:rPr>
-        <w:t xml:space="preserve">año </w:t>
+        <w:t>año </w:t>
       </w:r>
       <w:r>
         <w:rPr>
@@ -534,7 +523,6 @@
           <w:color w:val="303030"/>
           <w:sz w:val="28"/>
           <w:szCs w:val="28"/>
-          <w:highlight w:val="cyan"/>
           <w:lang w:val="es-CO"/>
         </w:rPr>
         <w:t>{de_del_a_o_1}</w:t>
@@ -547,7 +535,6 @@
           <w:color w:val="303030"/>
           <w:sz w:val="28"/>
           <w:szCs w:val="28"/>
-          <w:highlight w:val="cyan"/>
           <w:lang w:val="es-CO"/>
         </w:rPr>
       </w:r>
@@ -559,7 +546,6 @@
           <w:color w:val="303030"/>
           <w:sz w:val="28"/>
           <w:szCs w:val="28"/>
-          <w:highlight w:val="cyan"/>
           <w:lang w:val="es-CO"/>
         </w:rPr>
       </w:r>
@@ -573,7 +559,7 @@
           <w:szCs w:val="28"/>
           <w:lang w:val="es-CO"/>
         </w:rPr>
-        <w:t xml:space="preserve"> </w:t>
+        <w:t> </w:t>
       </w:r>
     </w:p>
     <w:p>
@@ -585,7 +571,6 @@
           <w:color w:val="303030"/>
           <w:sz w:val="22"/>
           <w:szCs w:val="20"/>
-          <w:highlight w:val="yellow"/>
         </w:rPr>
       </w:pPr>
     </w:p>
@@ -598,7 +583,6 @@
           <w:color w:val="303030"/>
           <w:sz w:val="22"/>
           <w:szCs w:val="20"/>
-          <w:highlight w:val="yellow"/>
           <w:lang w:val="es-CO"/>
         </w:rPr>
       </w:pPr>
@@ -612,7 +596,6 @@
           <w:color w:val="303030"/>
           <w:sz w:val="22"/>
           <w:szCs w:val="20"/>
-          <w:highlight w:val="yellow"/>
           <w:lang w:val="es-CO"/>
         </w:rPr>
       </w:pPr>
@@ -626,7 +609,6 @@
           <w:color w:val="303030"/>
           <w:sz w:val="22"/>
           <w:szCs w:val="20"/>
-          <w:highlight w:val="yellow"/>
           <w:lang w:val="es-CO"/>
         </w:rPr>
       </w:pPr>
@@ -640,7 +622,6 @@
           <w:color w:val="303030"/>
           <w:sz w:val="22"/>
           <w:szCs w:val="20"/>
-          <w:highlight w:val="yellow"/>
           <w:lang w:val="es-CO"/>
         </w:rPr>
       </w:pPr>
@@ -654,7 +635,6 @@
           <w:color w:val="303030"/>
           <w:sz w:val="22"/>
           <w:szCs w:val="20"/>
-          <w:highlight w:val="yellow"/>
           <w:lang w:val="es-CO"/>
         </w:rPr>
       </w:pPr>
@@ -668,7 +648,6 @@
           <w:color w:val="303030"/>
           <w:sz w:val="22"/>
           <w:szCs w:val="20"/>
-          <w:highlight w:val="yellow"/>
           <w:lang w:val="es-CO"/>
         </w:rPr>
       </w:pPr>
@@ -747,7 +726,6 @@
           <w:color w:val="303030"/>
           <w:sz w:val="22"/>
           <w:szCs w:val="20"/>
-          <w:highlight w:val="cyan"/>
           <w:lang w:val="es-CO"/>
         </w:rPr>
       </w:pPr>
@@ -758,7 +736,6 @@
           <w:color w:val="303030"/>
           <w:sz w:val="22"/>
           <w:szCs w:val="20"/>
-          <w:highlight w:val="cyan"/>
           <w:lang w:val="es-CO"/>
         </w:rPr>
         <w:t>{var_3}</w:t>
@@ -770,7 +747,6 @@
           <w:color w:val="303030"/>
           <w:sz w:val="22"/>
           <w:szCs w:val="20"/>
-          <w:highlight w:val="cyan"/>
           <w:lang w:val="es-CO"/>
         </w:rPr>
       </w:r>
@@ -782,7 +758,6 @@
           <w:color w:val="303030"/>
           <w:sz w:val="22"/>
           <w:szCs w:val="20"/>
-          <w:highlight w:val="cyan"/>
           <w:lang w:val="es-CO"/>
         </w:rPr>
       </w:r>
@@ -792,7 +767,6 @@
           <w:rStyle w:val="Refdecomentario"/>
           <w:rFonts w:ascii="Tahoma" w:eastAsia="Times New Roman" w:hAnsi="Tahoma"/>
           <w:szCs w:val="20"/>
-          <w:highlight w:val="cyan"/>
           <w:lang w:val="es-MX" w:eastAsia="es-MX"/>
         </w:rPr>
       </w:r>
@@ -806,7 +780,6 @@
           <w:b/>
           <w:color w:val="303030"/>
           <w:sz w:val="22"/>
-          <w:highlight w:val="yellow"/>
           <w:lang w:val="es-CO"/>
         </w:rPr>
       </w:pPr>
@@ -816,7 +789,6 @@
           <w:b/>
           <w:color w:val="303030"/>
           <w:sz w:val="22"/>
-          <w:highlight w:val="yellow"/>
           <w:lang w:val="es-CO"/>
         </w:rPr>
         <w:br w:type="page"/>
@@ -846,7 +818,7 @@
           <w:lang w:val="es-CO"/>
         </w:rPr>
         <w:lastRenderedPageBreak/>
-        <w:t xml:space="preserve">TABLA DE </w:t>
+        <w:t>TABLA DE </w:t>
       </w:r>
       <w:commentRangeStart w:id="5"/>
       <w:commentRangeStart w:id="6"/>
@@ -890,7 +862,7 @@
           <w:szCs w:val="32"/>
           <w:lang w:val="es-CO"/>
         </w:rPr>
-        <w:t xml:space="preserve"> </w:t>
+        <w:t> </w:t>
       </w:r>
     </w:p>
     <w:p>
@@ -920,7 +892,6 @@
           <w:noProof/>
           <w:color w:val="303030"/>
           <w:szCs w:val="22"/>
-          <w:highlight w:val="yellow"/>
           <w:lang w:eastAsia="es-MX"/>
         </w:rPr>
         <w:fldChar w:fldCharType="begin"/>
@@ -931,7 +902,6 @@
           <w:noProof/>
           <w:color w:val="303030"/>
           <w:szCs w:val="22"/>
-          <w:highlight w:val="yellow"/>
           <w:lang w:eastAsia="es-MX"/>
         </w:rPr>
         <w:instrText xml:space="preserve"> TOC \o "1-3" \h \z \u </w:instrText>
@@ -942,7 +912,6 @@
           <w:noProof/>
           <w:color w:val="303030"/>
           <w:szCs w:val="22"/>
-          <w:highlight w:val="yellow"/>
           <w:lang w:eastAsia="es-MX"/>
         </w:rPr>
         <w:fldChar w:fldCharType="separate"/>
@@ -2229,6 +2198,11 @@
           <w:fldChar w:fldCharType="end"/>
         </w:r>
       </w:hyperlink>
+    </w:p>
+    <w:p>
+      <w:r>
+        <w:t>{chart_indices}</w:t>
+      </w:r>
     </w:p>
     <w:p>
       <w:pPr>
@@ -2722,7 +2696,6 @@
           <w:caps w:val="0"/>
           <w:color w:val="303030"/>
           <w:szCs w:val="22"/>
-          <w:highlight w:val="yellow"/>
         </w:rPr>
       </w:pPr>
       <w:r>
@@ -2731,7 +2704,6 @@
           <w:noProof/>
           <w:color w:val="303030"/>
           <w:szCs w:val="22"/>
-          <w:highlight w:val="yellow"/>
           <w:lang w:eastAsia="es-MX"/>
         </w:rPr>
         <w:fldChar w:fldCharType="end"/>
@@ -2741,7 +2713,6 @@
           <w:rFonts w:eastAsia="Arial Unicode MS"/>
           <w:color w:val="303030"/>
           <w:szCs w:val="22"/>
-          <w:highlight w:val="yellow"/>
         </w:rPr>
         <w:br w:type="page"/>
       </w:r>
@@ -2768,7 +2739,7 @@
           <w:szCs w:val="32"/>
         </w:rPr>
         <w:lastRenderedPageBreak/>
-        <w:t xml:space="preserve">ÍNDICE DE </w:t>
+        <w:t>ÍNDICE DE </w:t>
       </w:r>
       <w:commentRangeStart w:id="7"/>
       <w:r>
@@ -2797,7 +2768,7 @@
           <w:sz w:val="32"/>
           <w:szCs w:val="32"/>
         </w:rPr>
-        <w:t xml:space="preserve"> </w:t>
+        <w:t> </w:t>
       </w:r>
     </w:p>
     <w:p>
@@ -2823,7 +2794,6 @@
           <w:noProof/>
           <w:color w:val="303030"/>
           <w:szCs w:val="20"/>
-          <w:highlight w:val="yellow"/>
           <w:lang w:val="es-CO"/>
         </w:rPr>
         <w:fldChar w:fldCharType="begin"/>
@@ -2835,7 +2805,6 @@
           <w:noProof/>
           <w:color w:val="303030"/>
           <w:szCs w:val="20"/>
-          <w:highlight w:val="yellow"/>
           <w:lang w:val="es-CO"/>
         </w:rPr>
         <w:instrText xml:space="preserve"> TOC \h \z \c "Tabla" </w:instrText>
@@ -2847,7 +2816,6 @@
           <w:noProof/>
           <w:color w:val="303030"/>
           <w:szCs w:val="20"/>
-          <w:highlight w:val="yellow"/>
           <w:lang w:val="es-CO"/>
         </w:rPr>
         <w:fldChar w:fldCharType="separate"/>
@@ -2943,7 +2911,7 @@
             <w:noProof/>
             <w:szCs w:val="20"/>
           </w:rPr>
-          <w:t xml:space="preserve">Tabla 2. </w:t>
+          <w:t>Tabla 2. </w:t>
         </w:r>
         <w:r>
           <w:rPr>
@@ -3453,7 +3421,7 @@
             <w:szCs w:val="20"/>
             <w:lang w:val="es-419"/>
           </w:rPr>
-          <w:t xml:space="preserve">Tabla 8. </w:t>
+          <w:t>Tabla 8. </w:t>
         </w:r>
         <w:r>
           <w:rPr>
@@ -3534,7 +3502,6 @@
           <w:noProof/>
           <w:color w:val="303030"/>
           <w:szCs w:val="20"/>
-          <w:highlight w:val="yellow"/>
           <w:lang w:val="es-CO"/>
         </w:rPr>
       </w:pPr>
@@ -3545,7 +3512,6 @@
           <w:noProof/>
           <w:color w:val="303030"/>
           <w:szCs w:val="20"/>
-          <w:highlight w:val="yellow"/>
           <w:lang w:val="es-CO"/>
         </w:rPr>
         <w:fldChar w:fldCharType="end"/>
@@ -3557,7 +3523,6 @@
           <w:noProof/>
           <w:color w:val="303030"/>
           <w:szCs w:val="20"/>
-          <w:highlight w:val="yellow"/>
           <w:lang w:val="es-CO"/>
         </w:rPr>
         <w:br w:type="page"/>
@@ -3589,7 +3554,7 @@
           <w:lang w:val="es-CO"/>
         </w:rPr>
         <w:lastRenderedPageBreak/>
-        <w:t xml:space="preserve">ÍNDICE DE </w:t>
+        <w:t>ÍNDICE DE </w:t>
       </w:r>
       <w:commentRangeStart w:id="8"/>
       <w:r>
@@ -3621,7 +3586,7 @@
           <w:szCs w:val="32"/>
           <w:lang w:val="es-CO"/>
         </w:rPr>
-        <w:t xml:space="preserve"> </w:t>
+        <w:t> </w:t>
       </w:r>
     </w:p>
     <w:p>
@@ -3647,7 +3612,6 @@
           <w:noProof/>
           <w:color w:val="303030"/>
           <w:szCs w:val="20"/>
-          <w:highlight w:val="yellow"/>
           <w:lang w:val="es-CO"/>
         </w:rPr>
         <w:fldChar w:fldCharType="begin"/>
@@ -3659,7 +3623,6 @@
           <w:noProof/>
           <w:color w:val="303030"/>
           <w:szCs w:val="20"/>
-          <w:highlight w:val="yellow"/>
           <w:lang w:val="es-CO"/>
         </w:rPr>
         <w:instrText xml:space="preserve"> TOC \h \z \c "Fotografía" </w:instrText>
@@ -3671,7 +3634,6 @@
           <w:noProof/>
           <w:color w:val="303030"/>
           <w:szCs w:val="20"/>
-          <w:highlight w:val="yellow"/>
           <w:lang w:val="es-CO"/>
         </w:rPr>
         <w:fldChar w:fldCharType="separate"/>
@@ -3685,7 +3647,7 @@
             <w:szCs w:val="20"/>
             <w:lang w:val="es-CO"/>
           </w:rPr>
-          <w:t>Fotografía 1. XXXX</w:t>
+          <w:t>Fotografía 1. {tag_foto1_desc}</w:t>
         </w:r>
         <w:r>
           <w:rPr>
@@ -3769,7 +3731,7 @@
             <w:szCs w:val="20"/>
             <w:lang w:val="es-CO"/>
           </w:rPr>
-          <w:t>Fotografía 2. XXXX</w:t>
+          <w:t>Fotografía 2. {tag_foto2_desc}</w:t>
         </w:r>
         <w:r>
           <w:rPr>
@@ -3839,7 +3801,6 @@
           <w:color w:val="303030"/>
           <w:sz w:val="20"/>
           <w:szCs w:val="20"/>
-          <w:highlight w:val="yellow"/>
           <w:lang w:val="es-CO" w:eastAsia="es-MX"/>
         </w:rPr>
       </w:pPr>
@@ -3851,7 +3812,6 @@
           <w:color w:val="303030"/>
           <w:sz w:val="20"/>
           <w:szCs w:val="20"/>
-          <w:highlight w:val="yellow"/>
           <w:lang w:val="es-CO" w:eastAsia="es-MX"/>
         </w:rPr>
         <w:fldChar w:fldCharType="end"/>
@@ -3864,7 +3824,6 @@
           <w:color w:val="303030"/>
           <w:sz w:val="20"/>
           <w:szCs w:val="20"/>
-          <w:highlight w:val="yellow"/>
           <w:lang w:val="es-CO" w:eastAsia="es-MX"/>
         </w:rPr>
         <w:br w:type="page"/>
@@ -3902,7 +3861,7 @@
           <w:szCs w:val="32"/>
           <w:lang w:val="es-CO"/>
         </w:rPr>
-        <w:t xml:space="preserve">NDICE DE </w:t>
+        <w:t>NDICE DE </w:t>
       </w:r>
       <w:commentRangeStart w:id="9"/>
       <w:r>
@@ -3950,7 +3909,6 @@
           <w:rFonts w:cs="Calibri"/>
           <w:color w:val="303030"/>
           <w:szCs w:val="20"/>
-          <w:highlight w:val="yellow"/>
           <w:lang w:val="es-CO"/>
         </w:rPr>
         <w:fldChar w:fldCharType="begin"/>
@@ -3960,7 +3918,6 @@
           <w:rFonts w:cs="Calibri"/>
           <w:color w:val="303030"/>
           <w:szCs w:val="20"/>
-          <w:highlight w:val="yellow"/>
           <w:lang w:val="es-CO"/>
         </w:rPr>
         <w:instrText xml:space="preserve"> TOC \h \z \c "Figura" </w:instrText>
@@ -3970,7 +3927,6 @@
           <w:rFonts w:cs="Calibri"/>
           <w:color w:val="303030"/>
           <w:szCs w:val="20"/>
-          <w:highlight w:val="yellow"/>
           <w:lang w:val="es-CO"/>
         </w:rPr>
         <w:fldChar w:fldCharType="separate"/>
@@ -3984,7 +3940,7 @@
             <w:color w:val="303030"/>
             <w:lang w:val="es-CO"/>
           </w:rPr>
-          <w:t xml:space="preserve">Figura 1. Ubicación geográfica </w:t>
+          <w:t>Figura 1. Ubicación geográfica </w:t>
         </w:r>
         <w:r>
           <w:rPr>
@@ -3992,7 +3948,6 @@
             <w:rFonts w:cs="Calibri"/>
             <w:noProof/>
             <w:color w:val="303030"/>
-            <w:highlight w:val="cyan"/>
             <w:lang w:val="es-CO"/>
           </w:rPr>
           <w:t>del punto</w:t>
@@ -4005,7 +3960,7 @@
             <w:color w:val="303030"/>
             <w:lang w:val="es-CO"/>
           </w:rPr>
-          <w:t xml:space="preserve"> de monitoreo</w:t>
+          <w:t> de monitoreo</w:t>
         </w:r>
         <w:r>
           <w:rPr>
@@ -4073,7 +4028,6 @@
           <w:color w:val="303030"/>
           <w:sz w:val="20"/>
           <w:szCs w:val="20"/>
-          <w:highlight w:val="yellow"/>
           <w:lang w:val="es-CO"/>
         </w:rPr>
       </w:pPr>
@@ -4083,7 +4037,6 @@
           <w:color w:val="303030"/>
           <w:sz w:val="20"/>
           <w:szCs w:val="20"/>
-          <w:highlight w:val="yellow"/>
           <w:lang w:val="es-CO"/>
         </w:rPr>
         <w:fldChar w:fldCharType="end"/>
@@ -4094,7 +4047,6 @@
           <w:color w:val="303030"/>
           <w:sz w:val="20"/>
           <w:szCs w:val="20"/>
-          <w:highlight w:val="yellow"/>
           <w:lang w:val="es-CO"/>
         </w:rPr>
         <w:br w:type="page"/>
@@ -4168,7 +4120,7 @@
           <w:sz w:val="22"/>
           <w:szCs w:val="22"/>
         </w:rPr>
-        <w:t xml:space="preserve">Realizar la evaluación de las condiciones hidrológicas </w:t>
+        <w:t>Realizar la evaluación de las condiciones hidrológicas </w:t>
       </w:r>
       <w:r>
         <w:rPr>
@@ -4176,7 +4128,6 @@
           <w:color w:val="303030"/>
           <w:sz w:val="22"/>
           <w:szCs w:val="22"/>
-          <w:highlight w:val="yellow"/>
         </w:rPr>
         <w:t>de los punto</w:t>
       </w:r>
@@ -4187,7 +4138,6 @@
           <w:color w:val="303030"/>
           <w:sz w:val="22"/>
           <w:szCs w:val="22"/>
-          <w:highlight w:val="yellow"/>
         </w:rPr>
         <w:t>s</w:t>
       </w:r>
@@ -4197,7 +4147,6 @@
           <w:rStyle w:val="Refdecomentario"/>
           <w:rFonts w:ascii="Tahoma" w:eastAsia="Times New Roman" w:hAnsi="Tahoma"/>
           <w:szCs w:val="20"/>
-          <w:highlight w:val="yellow"/>
           <w:lang w:val="es-MX" w:eastAsia="es-MX"/>
         </w:rPr>
         <w:commentReference w:id="29"/>
@@ -4209,7 +4158,7 @@
           <w:sz w:val="22"/>
           <w:szCs w:val="22"/>
         </w:rPr>
-        <w:t xml:space="preserve"> de monitoreo </w:t>
+        <w:t> de monitoreo </w:t>
       </w:r>
       <w:r>
         <w:rPr>
@@ -4217,7 +4166,6 @@
           <w:color w:val="303030"/>
           <w:sz w:val="22"/>
           <w:szCs w:val="22"/>
-          <w:highlight w:val="yellow"/>
         </w:rPr>
         <w:t>establecidos</w:t>
       </w:r>
@@ -4228,7 +4176,7 @@
           <w:sz w:val="22"/>
           <w:szCs w:val="22"/>
         </w:rPr>
-        <w:t xml:space="preserve"> para el programa de control y seguimiento de calidad del agua de</w:t>
+        <w:t> para el programa de control y seguimiento de calidad del agua de</w:t>
       </w:r>
       <w:r>
         <w:rPr>
@@ -4237,7 +4185,7 @@
           <w:sz w:val="22"/>
           <w:szCs w:val="22"/>
         </w:rPr>
-        <w:t xml:space="preserve"> la organización</w:t>
+        <w:t> la organización</w:t>
       </w:r>
       <w:r>
         <w:rPr>
@@ -4246,7 +4194,7 @@
           <w:sz w:val="22"/>
           <w:szCs w:val="22"/>
         </w:rPr>
-        <w:t xml:space="preserve"> </w:t>
+        <w:t> </w:t>
       </w:r>
       <w:r>
         <w:rPr>
@@ -4256,7 +4204,6 @@
           <w:color w:val="303030"/>
           <w:sz w:val="22"/>
           <w:szCs w:val="22"/>
-          <w:highlight w:val="cyan"/>
         </w:rPr>
         <w:t>{var_1}</w:t>
       </w:r>
@@ -4277,7 +4224,7 @@
       <w:bookmarkStart w:id="30" w:name="_Toc214355438"/>
       <w:bookmarkEnd w:id="20"/>
       <w:r>
-        <w:t xml:space="preserve">Objetivos </w:t>
+        <w:t>Objetivos </w:t>
       </w:r>
       <w:r>
         <w:t>e</w:t>
@@ -4389,7 +4336,6 @@
           <w:color w:val="303030"/>
           <w:sz w:val="22"/>
           <w:szCs w:val="22"/>
-          <w:highlight w:val="cyan"/>
         </w:rPr>
       </w:pPr>
     </w:p>
@@ -4402,7 +4348,6 @@
           <w:color w:val="303030"/>
           <w:sz w:val="22"/>
           <w:szCs w:val="22"/>
-          <w:highlight w:val="yellow"/>
           <w:lang w:val="es-CO"/>
         </w:rPr>
       </w:pPr>
@@ -4431,7 +4376,6 @@
           <w:color w:val="303030"/>
           <w:sz w:val="48"/>
           <w:szCs w:val="20"/>
-          <w:highlight w:val="yellow"/>
           <w:lang w:val="es-CO" w:eastAsia="es-MX"/>
         </w:rPr>
       </w:pPr>
@@ -4442,7 +4386,6 @@
           <w:bCs/>
           <w:color w:val="303030"/>
           <w:sz w:val="48"/>
-          <w:highlight w:val="yellow"/>
           <w:lang w:val="es-CO" w:eastAsia="es-MX"/>
         </w:rPr>
         <w:br w:type="page"/>
@@ -4461,7 +4404,7 @@
       <w:bookmarkEnd w:id="35"/>
       <w:r>
         <w:lastRenderedPageBreak/>
-        <w:t xml:space="preserve">CONDICIONES </w:t>
+        <w:t>CONDICIONES </w:t>
       </w:r>
       <w:r>
         <w:t>GENERALES</w:t>
@@ -4476,7 +4419,7 @@
       <w:bookmarkStart w:id="38" w:name="_Toc19781413"/>
       <w:bookmarkStart w:id="39" w:name="_Toc214355440"/>
       <w:r>
-        <w:t xml:space="preserve">Información de la </w:t>
+        <w:t>Información de la </w:t>
       </w:r>
       <w:commentRangeStart w:id="40"/>
       <w:r>
@@ -4573,7 +4516,7 @@
                 <w:szCs w:val="22"/>
                 <w:lang w:val="es-CO"/>
               </w:rPr>
-              <w:t xml:space="preserve"> social:</w:t>
+              <w:t> social:</w:t>
             </w:r>
           </w:p>
         </w:tc>
@@ -4599,7 +4542,7 @@
                 <w:sz w:val="22"/>
                 <w:szCs w:val="22"/>
               </w:rPr>
-              <w:t>Razón social completa</w:t>
+              <w:t>{tag_razon_social}</w:t>
             </w:r>
           </w:p>
         </w:tc>
@@ -4656,7 +4599,7 @@
                 <w:sz w:val="22"/>
                 <w:szCs w:val="22"/>
               </w:rPr>
-              <w:t>Relacionado en la OIT</w:t>
+              <w:t>{tag_correo_valor}</w:t>
             </w:r>
           </w:p>
         </w:tc>
@@ -4713,7 +4656,7 @@
                 <w:sz w:val="22"/>
                 <w:szCs w:val="22"/>
               </w:rPr>
-              <w:t>Nombre del representante del cliente</w:t>
+              <w:t>{tag_representante}</w:t>
             </w:r>
           </w:p>
         </w:tc>
@@ -4744,7 +4687,7 @@
                 <w:szCs w:val="22"/>
                 <w:lang w:val="es-CO"/>
               </w:rPr>
-              <w:t xml:space="preserve">Teléfono: </w:t>
+              <w:t>Teléfono: </w:t>
             </w:r>
           </w:p>
         </w:tc>
@@ -4770,7 +4713,7 @@
                 <w:sz w:val="22"/>
                 <w:szCs w:val="22"/>
               </w:rPr>
-              <w:t>Teléfono del representante del cliente</w:t>
+              <w:t>{tag_telefono_valor}</w:t>
             </w:r>
           </w:p>
         </w:tc>
@@ -4827,7 +4770,7 @@
                 <w:sz w:val="22"/>
                 <w:szCs w:val="22"/>
               </w:rPr>
-              <w:t>Dirección donde se ubica la sede del cliente u oficinas principales</w:t>
+              <w:t>{tag_direccion}</w:t>
             </w:r>
           </w:p>
         </w:tc>
@@ -4884,7 +4827,7 @@
                 <w:sz w:val="22"/>
                 <w:szCs w:val="22"/>
               </w:rPr>
-              <w:t>Departamento donde se ejecutó el monitoreo</w:t>
+              <w:t>{tag_departamento}</w:t>
             </w:r>
           </w:p>
         </w:tc>
@@ -4926,7 +4869,7 @@
                 <w:szCs w:val="22"/>
                 <w:lang w:val="es-CO"/>
               </w:rPr>
-              <w:t xml:space="preserve">unicipio: </w:t>
+              <w:t>unicipio: </w:t>
             </w:r>
             <w:r>
               <w:rPr>
@@ -4962,7 +4905,7 @@
                 <w:sz w:val="22"/>
                 <w:szCs w:val="22"/>
               </w:rPr>
-              <w:t>Municipio/ciudad donde se ejecutó el monitoreo</w:t>
+              <w:t>{tag_ciudad}</w:t>
             </w:r>
           </w:p>
         </w:tc>
@@ -5019,7 +4962,7 @@
                 <w:sz w:val="22"/>
                 <w:szCs w:val="22"/>
               </w:rPr>
-              <w:t xml:space="preserve">Se obtiene del RUES o la página web del cliente </w:t>
+              <w:t>{tag_actividad_economica} </w:t>
             </w:r>
           </w:p>
         </w:tc>
@@ -5031,7 +4974,7 @@
       </w:pPr>
       <w:bookmarkStart w:id="50" w:name="_Toc214355441"/>
       <w:r>
-        <w:t xml:space="preserve">Empresa responsable del </w:t>
+        <w:t>Empresa responsable del </w:t>
       </w:r>
       <w:bookmarkEnd w:id="41"/>
       <w:r>
@@ -5067,7 +5010,7 @@
           <w:szCs w:val="22"/>
           <w:lang w:val="es-ES"/>
         </w:rPr>
-        <w:t xml:space="preserve">La visita de campo fue realizada por el laboratorio </w:t>
+        <w:t>La visita de campo fue realizada por el laboratorio </w:t>
       </w:r>
       <w:r>
         <w:rPr>
@@ -5099,7 +5042,7 @@
           <w:szCs w:val="22"/>
           <w:lang w:val="es-ES"/>
         </w:rPr>
-        <w:t xml:space="preserve"> </w:t>
+        <w:t> </w:t>
       </w:r>
       <w:r>
         <w:rPr>
@@ -5109,7 +5052,7 @@
           <w:szCs w:val="22"/>
           <w:lang w:val="es-ES"/>
         </w:rPr>
-        <w:t xml:space="preserve">el NIT 900027049-2. </w:t>
+        <w:t>el NIT 900027049-2. </w:t>
       </w:r>
       <w:r>
         <w:rPr>
@@ -5127,7 +5070,7 @@
           <w:sz w:val="22"/>
           <w:szCs w:val="22"/>
         </w:rPr>
-        <w:t xml:space="preserve"> </w:t>
+        <w:t> </w:t>
       </w:r>
       <w:r>
         <w:rPr>
@@ -5182,7 +5125,7 @@
           <w:szCs w:val="22"/>
           <w:lang w:val="es-CO"/>
         </w:rPr>
-        <w:t xml:space="preserve">Tabla </w:t>
+        <w:t>Tabla </w:t>
       </w:r>
       <w:r>
         <w:rPr>
@@ -5226,7 +5169,7 @@
           <w:sz w:val="22"/>
           <w:szCs w:val="22"/>
         </w:rPr>
-        <w:t xml:space="preserve"> se relacionan los laboratorios </w:t>
+        <w:t> se relacionan los laboratorios </w:t>
       </w:r>
       <w:r>
         <w:rPr>
@@ -5235,7 +5178,7 @@
           <w:sz w:val="22"/>
           <w:szCs w:val="22"/>
         </w:rPr>
-        <w:t xml:space="preserve">que serían </w:t>
+        <w:t>que serían </w:t>
       </w:r>
       <w:r>
         <w:rPr>
@@ -5253,7 +5196,7 @@
           <w:sz w:val="22"/>
           <w:szCs w:val="22"/>
         </w:rPr>
-        <w:t xml:space="preserve">. </w:t>
+        <w:t>. </w:t>
       </w:r>
     </w:p>
     <w:p>
@@ -5293,7 +5236,7 @@
           <w:szCs w:val="20"/>
           <w:lang w:val="es-CO"/>
         </w:rPr>
-        <w:t xml:space="preserve">Tabla </w:t>
+        <w:t>Tabla </w:t>
       </w:r>
       <w:r>
         <w:rPr>
@@ -5374,7 +5317,7 @@
           <w:szCs w:val="20"/>
           <w:lang w:val="es-CO"/>
         </w:rPr>
-        <w:t xml:space="preserve"> </w:t>
+        <w:t> </w:t>
       </w:r>
     </w:p>
     <w:tbl>
@@ -5410,7 +5353,6 @@
           <w:tcPr>
             <w:tcW w:w="1518" w:type="pct"/>
             <w:vMerge w:val="restart"/>
-            <w:shd w:val="clear" w:color="auto" w:fill="004CAB"/>
             <w:noWrap/>
             <w:vAlign w:val="center"/>
             <w:hideMark/>
@@ -5446,7 +5388,6 @@
           <w:tcPr>
             <w:tcW w:w="1771" w:type="pct"/>
             <w:vMerge w:val="restart"/>
-            <w:shd w:val="clear" w:color="auto" w:fill="004CAB"/>
             <w:vAlign w:val="center"/>
             <w:hideMark/>
           </w:tcPr>
@@ -5481,7 +5422,6 @@
           <w:tcPr>
             <w:tcW w:w="1711" w:type="pct"/>
             <w:vMerge w:val="restart"/>
-            <w:shd w:val="clear" w:color="auto" w:fill="004CAB"/>
             <w:vAlign w:val="center"/>
             <w:hideMark/>
           </w:tcPr>
@@ -5523,7 +5463,6 @@
           <w:tcPr>
             <w:tcW w:w="1518" w:type="pct"/>
             <w:vMerge/>
-            <w:shd w:val="clear" w:color="auto" w:fill="004CAB"/>
             <w:vAlign w:val="center"/>
             <w:hideMark/>
           </w:tcPr>
@@ -5546,7 +5485,6 @@
           <w:tcPr>
             <w:tcW w:w="1771" w:type="pct"/>
             <w:vMerge/>
-            <w:shd w:val="clear" w:color="auto" w:fill="004CAB"/>
             <w:vAlign w:val="center"/>
             <w:hideMark/>
           </w:tcPr>
@@ -5569,7 +5507,6 @@
           <w:tcPr>
             <w:tcW w:w="1711" w:type="pct"/>
             <w:vMerge/>
-            <w:shd w:val="clear" w:color="auto" w:fill="004CAB"/>
             <w:vAlign w:val="center"/>
             <w:hideMark/>
           </w:tcPr>
@@ -5597,7 +5534,6 @@
         <w:tc>
           <w:tcPr>
             <w:tcW w:w="1518" w:type="pct"/>
-            <w:shd w:val="clear" w:color="auto" w:fill="auto"/>
             <w:noWrap/>
             <w:vAlign w:val="center"/>
             <w:hideMark/>
@@ -5621,14 +5557,13 @@
                 <w:szCs w:val="20"/>
                 <w:lang w:val="es-CO" w:eastAsia="es-CO"/>
               </w:rPr>
-              <w:t>Nombre Laboratorio</w:t>
+              <w:t>{tag_lab_nombre}</w:t>
             </w:r>
           </w:p>
         </w:tc>
         <w:tc>
           <w:tcPr>
             <w:tcW w:w="1771" w:type="pct"/>
-            <w:shd w:val="clear" w:color="auto" w:fill="auto"/>
             <w:noWrap/>
             <w:vAlign w:val="center"/>
           </w:tcPr>
@@ -5651,14 +5586,13 @@
                 <w:szCs w:val="20"/>
                 <w:lang w:val="es-CO" w:eastAsia="es-CO"/>
               </w:rPr>
-              <w:t xml:space="preserve">Nombre parámetro </w:t>
+              <w:t>{tag_lab_parametro} </w:t>
             </w:r>
           </w:p>
         </w:tc>
         <w:tc>
           <w:tcPr>
             <w:tcW w:w="1711" w:type="pct"/>
-            <w:shd w:val="clear" w:color="auto" w:fill="auto"/>
             <w:noWrap/>
             <w:vAlign w:val="center"/>
             <w:hideMark/>
@@ -5681,7 +5615,7 @@
                 <w:sz w:val="20"/>
                 <w:szCs w:val="20"/>
               </w:rPr>
-              <w:t xml:space="preserve">Número y </w:t>
+              <w:t>Número y </w:t>
             </w:r>
             <w:commentRangeStart w:id="56"/>
             <w:r>
@@ -5710,7 +5644,7 @@
                 <w:sz w:val="20"/>
                 <w:szCs w:val="20"/>
               </w:rPr>
-              <w:t xml:space="preserve"> de Resolución</w:t>
+              <w:t> de Resolución</w:t>
             </w:r>
           </w:p>
         </w:tc>
@@ -5737,7 +5671,7 @@
           <w:sz w:val="20"/>
           <w:lang w:val="es-CO"/>
         </w:rPr>
-        <w:t xml:space="preserve">Fuente: </w:t>
+        <w:t>Fuente: </w:t>
       </w:r>
       <w:commentRangeStart w:id="57"/>
       <w:r>
@@ -5768,7 +5702,7 @@
           <w:sz w:val="20"/>
           <w:lang w:val="es-CO"/>
         </w:rPr>
-        <w:t xml:space="preserve">., </w:t>
+        <w:t>., </w:t>
       </w:r>
       <w:commentRangeStart w:id="58"/>
       <w:r>
@@ -5801,7 +5735,6 @@
           <w:color w:val="303030"/>
           <w:sz w:val="22"/>
           <w:szCs w:val="22"/>
-          <w:highlight w:val="magenta"/>
           <w:lang w:val="es-CO"/>
         </w:rPr>
       </w:pPr>
@@ -5811,10 +5744,9 @@
           <w:color w:val="303030"/>
           <w:sz w:val="22"/>
           <w:szCs w:val="22"/>
-          <w:highlight w:val="magenta"/>
-          <w:lang w:val="es-CO"/>
-        </w:rPr>
-        <w:t xml:space="preserve">Asimismo, la </w:t>
+          <w:lang w:val="es-CO"/>
+        </w:rPr>
+        <w:t>Asimismo, la </w:t>
       </w:r>
       <w:r>
         <w:rPr>
@@ -5824,7 +5756,6 @@
           <w:color w:val="303030"/>
           <w:sz w:val="22"/>
           <w:szCs w:val="22"/>
-          <w:highlight w:val="magenta"/>
           <w:lang w:val="es-CO"/>
         </w:rPr>
         <w:fldChar w:fldCharType="begin"/>
@@ -5837,7 +5768,6 @@
           <w:color w:val="303030"/>
           <w:sz w:val="22"/>
           <w:szCs w:val="22"/>
-          <w:highlight w:val="magenta"/>
           <w:lang w:val="es-CO"/>
         </w:rPr>
         <w:instrText xml:space="preserve"> REF _Ref210901510 \h  \* MERGEFORMAT </w:instrText>
@@ -5850,7 +5780,6 @@
           <w:color w:val="303030"/>
           <w:sz w:val="22"/>
           <w:szCs w:val="22"/>
-          <w:highlight w:val="magenta"/>
           <w:lang w:val="es-CO"/>
         </w:rPr>
       </w:r>
@@ -5862,7 +5791,6 @@
           <w:color w:val="303030"/>
           <w:sz w:val="22"/>
           <w:szCs w:val="22"/>
-          <w:highlight w:val="magenta"/>
           <w:lang w:val="es-CO"/>
         </w:rPr>
         <w:fldChar w:fldCharType="separate"/>
@@ -5875,9 +5803,8 @@
           <w:color w:val="303030"/>
           <w:sz w:val="22"/>
           <w:szCs w:val="22"/>
-          <w:highlight w:val="magenta"/>
-        </w:rPr>
-        <w:t xml:space="preserve">Tabla </w:t>
+        </w:rPr>
+        <w:t>Tabla </w:t>
       </w:r>
       <w:r>
         <w:rPr>
@@ -5888,7 +5815,6 @@
           <w:color w:val="303030"/>
           <w:sz w:val="22"/>
           <w:szCs w:val="22"/>
-          <w:highlight w:val="magenta"/>
         </w:rPr>
         <w:t>2</w:t>
       </w:r>
@@ -5900,7 +5826,6 @@
           <w:color w:val="303030"/>
           <w:sz w:val="22"/>
           <w:szCs w:val="22"/>
-          <w:highlight w:val="magenta"/>
           <w:lang w:val="es-CO"/>
         </w:rPr>
         <w:fldChar w:fldCharType="end"/>
@@ -5913,7 +5838,6 @@
           <w:color w:val="303030"/>
           <w:sz w:val="22"/>
           <w:szCs w:val="22"/>
-          <w:highlight w:val="magenta"/>
           <w:lang w:val="es-CO"/>
         </w:rPr>
         <w:t>,</w:t>
@@ -5924,10 +5848,9 @@
           <w:color w:val="303030"/>
           <w:sz w:val="22"/>
           <w:szCs w:val="22"/>
-          <w:highlight w:val="magenta"/>
-          <w:lang w:val="es-CO"/>
-        </w:rPr>
-        <w:t xml:space="preserve"> </w:t>
+          <w:lang w:val="es-CO"/>
+        </w:rPr>
+        <w:t> </w:t>
       </w:r>
       <w:r>
         <w:rPr>
@@ -5935,9 +5858,8 @@
           <w:color w:val="303030"/>
           <w:sz w:val="22"/>
           <w:szCs w:val="22"/>
-          <w:highlight w:val="magenta"/>
-        </w:rPr>
-        <w:t xml:space="preserve">se presentan aquel parámetro que no se encuentra acreditado, pero que fue analizado por el </w:t>
+        </w:rPr>
+        <w:t>se presentan aquel parámetro que no se encuentra acreditado, pero que fue analizado por el </w:t>
       </w:r>
       <w:commentRangeStart w:id="59"/>
       <w:r>
@@ -5946,7 +5868,6 @@
           <w:color w:val="303030"/>
           <w:sz w:val="22"/>
           <w:szCs w:val="22"/>
-          <w:highlight w:val="magenta"/>
         </w:rPr>
         <w:t>laboratorio</w:t>
       </w:r>
@@ -5966,10 +5887,9 @@
           <w:color w:val="303030"/>
           <w:sz w:val="22"/>
           <w:szCs w:val="22"/>
-          <w:highlight w:val="magenta"/>
-          <w:lang w:val="es-CO"/>
-        </w:rPr>
-        <w:t xml:space="preserve">. </w:t>
+          <w:lang w:val="es-CO"/>
+        </w:rPr>
+        <w:t>. </w:t>
       </w:r>
     </w:p>
     <w:p>
@@ -5981,7 +5901,6 @@
         <w:rPr>
           <w:rFonts w:ascii="Avenir Next LT Pro" w:hAnsi="Avenir Next LT Pro"/>
           <w:color w:val="303030"/>
-          <w:highlight w:val="magenta"/>
         </w:rPr>
       </w:pPr>
       <w:bookmarkStart w:id="60" w:name="_Ref210901510"/>
@@ -5992,15 +5911,13 @@
         <w:rPr>
           <w:rFonts w:ascii="Avenir Next LT Pro" w:hAnsi="Avenir Next LT Pro"/>
           <w:color w:val="303030"/>
-          <w:highlight w:val="magenta"/>
-        </w:rPr>
-        <w:t xml:space="preserve">Tabla </w:t>
+        </w:rPr>
+        <w:t>Tabla </w:t>
       </w:r>
       <w:r>
         <w:rPr>
           <w:rFonts w:ascii="Avenir Next LT Pro" w:hAnsi="Avenir Next LT Pro"/>
           <w:color w:val="303030"/>
-          <w:highlight w:val="magenta"/>
         </w:rPr>
         <w:fldChar w:fldCharType="begin"/>
       </w:r>
@@ -6008,7 +5925,6 @@
         <w:rPr>
           <w:rFonts w:ascii="Avenir Next LT Pro" w:hAnsi="Avenir Next LT Pro"/>
           <w:color w:val="303030"/>
-          <w:highlight w:val="magenta"/>
         </w:rPr>
         <w:instrText xml:space="preserve"> SEQ Tabla \* ARABIC </w:instrText>
       </w:r>
@@ -6016,7 +5932,6 @@
         <w:rPr>
           <w:rFonts w:ascii="Avenir Next LT Pro" w:hAnsi="Avenir Next LT Pro"/>
           <w:color w:val="303030"/>
-          <w:highlight w:val="magenta"/>
         </w:rPr>
         <w:fldChar w:fldCharType="separate"/>
       </w:r>
@@ -6025,7 +5940,6 @@
           <w:rFonts w:ascii="Avenir Next LT Pro" w:hAnsi="Avenir Next LT Pro"/>
           <w:noProof/>
           <w:color w:val="303030"/>
-          <w:highlight w:val="magenta"/>
         </w:rPr>
         <w:t>2</w:t>
       </w:r>
@@ -6033,7 +5947,6 @@
         <w:rPr>
           <w:rFonts w:ascii="Avenir Next LT Pro" w:hAnsi="Avenir Next LT Pro"/>
           <w:color w:val="303030"/>
-          <w:highlight w:val="magenta"/>
         </w:rPr>
         <w:fldChar w:fldCharType="end"/>
       </w:r>
@@ -6042,16 +5955,14 @@
         <w:rPr>
           <w:rFonts w:ascii="Avenir Next LT Pro" w:hAnsi="Avenir Next LT Pro"/>
           <w:color w:val="303030"/>
-          <w:highlight w:val="magenta"/>
-        </w:rPr>
-        <w:t xml:space="preserve">. </w:t>
+        </w:rPr>
+        <w:t>. </w:t>
       </w:r>
       <w:bookmarkStart w:id="64" w:name="_Hlk103075186"/>
       <w:r>
         <w:rPr>
           <w:rFonts w:ascii="Avenir Next LT Pro" w:hAnsi="Avenir Next LT Pro" w:cstheme="majorHAnsi"/>
           <w:color w:val="303030"/>
-          <w:highlight w:val="magenta"/>
         </w:rPr>
         <w:t>Laboratorio responsable del análisis no acreditado.</w:t>
       </w:r>
@@ -6089,7 +6000,6 @@
         <w:tc>
           <w:tcPr>
             <w:tcW w:w="1708" w:type="pct"/>
-            <w:shd w:val="clear" w:color="auto" w:fill="004CAB"/>
             <w:vAlign w:val="center"/>
             <w:hideMark/>
           </w:tcPr>
@@ -6104,7 +6014,6 @@
                 <w:color w:val="FFFFFF" w:themeColor="background1"/>
                 <w:sz w:val="20"/>
                 <w:szCs w:val="20"/>
-                <w:highlight w:val="magenta"/>
                 <w:lang w:val="es-CO"/>
               </w:rPr>
             </w:pPr>
@@ -6116,7 +6025,6 @@
                 <w:color w:val="FFFFFF" w:themeColor="background1"/>
                 <w:sz w:val="20"/>
                 <w:szCs w:val="20"/>
-                <w:highlight w:val="magenta"/>
                 <w:lang w:val="es-CO"/>
               </w:rPr>
               <w:t>Laboratorio</w:t>
@@ -6126,7 +6034,6 @@
         <w:tc>
           <w:tcPr>
             <w:tcW w:w="3292" w:type="pct"/>
-            <w:shd w:val="clear" w:color="auto" w:fill="004CAB"/>
             <w:vAlign w:val="center"/>
             <w:hideMark/>
           </w:tcPr>
@@ -6141,7 +6048,6 @@
                 <w:color w:val="FFFFFF" w:themeColor="background1"/>
                 <w:sz w:val="20"/>
                 <w:szCs w:val="20"/>
-                <w:highlight w:val="magenta"/>
                 <w:lang w:val="es-CO"/>
               </w:rPr>
             </w:pPr>
@@ -6153,7 +6059,6 @@
                 <w:color w:val="FFFFFF" w:themeColor="background1"/>
                 <w:sz w:val="20"/>
                 <w:szCs w:val="20"/>
-                <w:highlight w:val="magenta"/>
                 <w:lang w:val="es-CO"/>
               </w:rPr>
               <w:t>Parámetro</w:t>
@@ -6168,7 +6073,6 @@
         <w:tc>
           <w:tcPr>
             <w:tcW w:w="1708" w:type="pct"/>
-            <w:shd w:val="clear" w:color="auto" w:fill="auto"/>
             <w:vAlign w:val="center"/>
           </w:tcPr>
           <w:p>
@@ -6180,7 +6084,6 @@
                 <w:color w:val="303030"/>
                 <w:sz w:val="20"/>
                 <w:szCs w:val="20"/>
-                <w:highlight w:val="magenta"/>
                 <w:lang w:val="es-CO"/>
               </w:rPr>
             </w:pPr>
@@ -6195,7 +6098,6 @@
               <w:bottom w:val="single" w:sz="4" w:space="0" w:color="808080"/>
               <w:right w:val="single" w:sz="4" w:space="0" w:color="808080"/>
             </w:tcBorders>
-            <w:shd w:val="clear" w:color="auto" w:fill="auto"/>
             <w:noWrap/>
             <w:vAlign w:val="center"/>
           </w:tcPr>
@@ -6208,7 +6110,6 @@
                 <w:color w:val="303030"/>
                 <w:sz w:val="20"/>
                 <w:szCs w:val="20"/>
-                <w:highlight w:val="magenta"/>
                 <w:lang w:val="es-CO"/>
               </w:rPr>
             </w:pPr>
@@ -6242,10 +6143,9 @@
           <w:color w:val="303030"/>
           <w:sz w:val="20"/>
           <w:szCs w:val="20"/>
-          <w:highlight w:val="magenta"/>
-          <w:lang w:val="es-CO"/>
-        </w:rPr>
-        <w:t>Fuente: SERAMBIENTE S.A.S., 202</w:t>
+          <w:lang w:val="es-CO"/>
+        </w:rPr>
+        <w:t>Fuente: SERAMBIENTE S.A.S., {tag_year}</w:t>
       </w:r>
       <w:r>
         <w:rPr>
@@ -6257,22 +6157,6 @@
           <w:color w:val="303030"/>
           <w:sz w:val="20"/>
           <w:szCs w:val="20"/>
-          <w:highlight w:val="magenta"/>
-          <w:lang w:val="es-CO"/>
-        </w:rPr>
-        <w:t>X</w:t>
-      </w:r>
-      <w:r>
-        <w:rPr>
-          <w:rStyle w:val="nfasis"/>
-          <w:rFonts w:ascii="Avenir Next LT Pro" w:hAnsi="Avenir Next LT Pro" w:cstheme="majorHAnsi"/>
-          <w:b w:val="0"/>
-          <w:bCs w:val="0"/>
-          <w:i/>
-          <w:color w:val="303030"/>
-          <w:sz w:val="20"/>
-          <w:szCs w:val="20"/>
-          <w:highlight w:val="magenta"/>
           <w:lang w:val="es-CO"/>
         </w:rPr>
         <w:t>.</w:t>
@@ -6300,7 +6184,7 @@
           <w:szCs w:val="22"/>
           <w:lang w:val="es-ES"/>
         </w:rPr>
-        <w:t xml:space="preserve">Seguidamente, en </w:t>
+        <w:t>Seguidamente, en </w:t>
       </w:r>
       <w:r>
         <w:rPr>
@@ -6310,7 +6194,7 @@
           <w:szCs w:val="22"/>
           <w:lang w:val="es-ES"/>
         </w:rPr>
-        <w:t xml:space="preserve">la </w:t>
+        <w:t>la </w:t>
       </w:r>
       <w:r>
         <w:rPr>
@@ -6374,7 +6258,7 @@
           <w:szCs w:val="22"/>
           <w:lang w:val="es-CO"/>
         </w:rPr>
-        <w:t xml:space="preserve">Tabla </w:t>
+        <w:t>Tabla </w:t>
       </w:r>
       <w:r>
         <w:rPr>
@@ -6407,7 +6291,7 @@
           <w:szCs w:val="22"/>
           <w:lang w:val="es-ES"/>
         </w:rPr>
-        <w:t xml:space="preserve"> </w:t>
+        <w:t> se presentan</w:t>
       </w:r>
       <w:r>
         <w:rPr>
@@ -6417,17 +6301,7 @@
           <w:szCs w:val="22"/>
           <w:lang w:val="es-ES"/>
         </w:rPr>
-        <w:t>se presentan</w:t>
-      </w:r>
-      <w:r>
-        <w:rPr>
-          <w:rFonts w:ascii="Avenir Next LT Pro" w:hAnsi="Avenir Next LT Pro" w:cstheme="majorHAnsi"/>
-          <w:color w:val="303030"/>
-          <w:sz w:val="22"/>
-          <w:szCs w:val="22"/>
-          <w:lang w:val="es-ES"/>
-        </w:rPr>
-        <w:t xml:space="preserve"> los datos generales del monitoreo.</w:t>
+        <w:t> los datos generales del monitoreo.</w:t>
       </w:r>
       <w:r>
         <w:rPr>
@@ -6439,7 +6313,7 @@
           <w:szCs w:val="22"/>
           <w:lang w:val="es-ES"/>
         </w:rPr>
-        <w:t xml:space="preserve"> </w:t>
+        <w:t> </w:t>
       </w:r>
     </w:p>
     <w:p>
@@ -6482,7 +6356,7 @@
           <w:lang w:val="es-CO"/>
         </w:rPr>
         <w:lastRenderedPageBreak/>
-        <w:t xml:space="preserve">Tabla </w:t>
+        <w:t>Tabla </w:t>
       </w:r>
       <w:r>
         <w:rPr>
@@ -6551,7 +6425,7 @@
           <w:szCs w:val="20"/>
           <w:lang w:val="es-CO"/>
         </w:rPr>
-        <w:t xml:space="preserve">. </w:t>
+        <w:t>. </w:t>
       </w:r>
       <w:bookmarkEnd w:id="52"/>
       <w:bookmarkEnd w:id="66"/>
@@ -6577,7 +6451,7 @@
           <w:szCs w:val="20"/>
           <w:lang w:val="es-CO"/>
         </w:rPr>
-        <w:t xml:space="preserve"> </w:t>
+        <w:t> </w:t>
       </w:r>
     </w:p>
     <w:tbl>
@@ -6609,7 +6483,6 @@
         <w:tc>
           <w:tcPr>
             <w:tcW w:w="1868" w:type="pct"/>
-            <w:shd w:val="clear" w:color="auto" w:fill="004CAB"/>
             <w:noWrap/>
             <w:vAlign w:val="center"/>
           </w:tcPr>
@@ -6636,14 +6509,13 @@
                 <w:szCs w:val="20"/>
                 <w:lang w:val="es-CO" w:eastAsia="es-CO"/>
               </w:rPr>
-              <w:t>Fecha de monitoreo</w:t>
+              <w:t>{tag_fecha_monitoreo}</w:t>
             </w:r>
           </w:p>
         </w:tc>
         <w:tc>
           <w:tcPr>
             <w:tcW w:w="3132" w:type="pct"/>
-            <w:shd w:val="clear" w:color="auto" w:fill="auto"/>
             <w:noWrap/>
             <w:vAlign w:val="center"/>
           </w:tcPr>
@@ -6668,7 +6540,6 @@
         <w:tc>
           <w:tcPr>
             <w:tcW w:w="1868" w:type="pct"/>
-            <w:shd w:val="clear" w:color="auto" w:fill="004CAB"/>
             <w:noWrap/>
             <w:vAlign w:val="center"/>
           </w:tcPr>
@@ -6695,14 +6566,13 @@
                 <w:szCs w:val="20"/>
                 <w:lang w:val="es-CO" w:eastAsia="es-CO"/>
               </w:rPr>
-              <w:t>Lugar de monitoreo</w:t>
+              <w:t>{tag_lugar_monitoreo}</w:t>
             </w:r>
           </w:p>
         </w:tc>
         <w:tc>
           <w:tcPr>
             <w:tcW w:w="3132" w:type="pct"/>
-            <w:shd w:val="clear" w:color="auto" w:fill="auto"/>
             <w:noWrap/>
             <w:vAlign w:val="center"/>
           </w:tcPr>
@@ -6727,7 +6597,6 @@
         <w:tc>
           <w:tcPr>
             <w:tcW w:w="1868" w:type="pct"/>
-            <w:shd w:val="clear" w:color="auto" w:fill="004CAB"/>
             <w:noWrap/>
             <w:vAlign w:val="center"/>
           </w:tcPr>
@@ -6754,14 +6623,13 @@
                 <w:szCs w:val="20"/>
                 <w:lang w:val="es-CO" w:eastAsia="es-CO"/>
               </w:rPr>
-              <w:t>Duración del muestreo</w:t>
+              <w:t>{tag_duracion_muestreo}</w:t>
             </w:r>
           </w:p>
         </w:tc>
         <w:tc>
           <w:tcPr>
             <w:tcW w:w="3132" w:type="pct"/>
-            <w:shd w:val="clear" w:color="auto" w:fill="auto"/>
             <w:noWrap/>
             <w:vAlign w:val="center"/>
           </w:tcPr>
@@ -6786,7 +6654,6 @@
         <w:tc>
           <w:tcPr>
             <w:tcW w:w="1868" w:type="pct"/>
-            <w:shd w:val="clear" w:color="auto" w:fill="004CAB"/>
             <w:noWrap/>
             <w:vAlign w:val="center"/>
           </w:tcPr>
@@ -6813,14 +6680,13 @@
                 <w:szCs w:val="20"/>
                 <w:lang w:val="es-CO" w:eastAsia="es-CO"/>
               </w:rPr>
-              <w:t>Puntos de monitoreo</w:t>
+              <w:t>{tag_puntos_monitoreo}</w:t>
             </w:r>
           </w:p>
         </w:tc>
         <w:tc>
           <w:tcPr>
             <w:tcW w:w="3132" w:type="pct"/>
-            <w:shd w:val="clear" w:color="auto" w:fill="auto"/>
             <w:noWrap/>
             <w:vAlign w:val="center"/>
           </w:tcPr>
@@ -6843,7 +6709,6 @@
         <w:tc>
           <w:tcPr>
             <w:tcW w:w="1868" w:type="pct"/>
-            <w:shd w:val="clear" w:color="auto" w:fill="004CAB"/>
             <w:noWrap/>
             <w:vAlign w:val="center"/>
           </w:tcPr>
@@ -6900,7 +6765,6 @@
         <w:tc>
           <w:tcPr>
             <w:tcW w:w="3132" w:type="pct"/>
-            <w:shd w:val="clear" w:color="auto" w:fill="auto"/>
             <w:noWrap/>
             <w:vAlign w:val="center"/>
           </w:tcPr>
@@ -6940,7 +6804,7 @@
           <w:sz w:val="20"/>
           <w:lang w:val="es-CO"/>
         </w:rPr>
-        <w:t xml:space="preserve">Fuente: </w:t>
+        <w:t>Fuente: </w:t>
       </w:r>
       <w:commentRangeStart w:id="70"/>
       <w:r>
@@ -6971,7 +6835,7 @@
           <w:sz w:val="20"/>
           <w:lang w:val="es-CO"/>
         </w:rPr>
-        <w:t xml:space="preserve">., </w:t>
+        <w:t>., </w:t>
       </w:r>
       <w:commentRangeStart w:id="71"/>
       <w:r>
@@ -6982,17 +6846,7 @@
           <w:sz w:val="20"/>
           <w:lang w:val="es-CO"/>
         </w:rPr>
-        <w:t>XXXX</w:t>
-      </w:r>
-      <w:r>
-        <w:rPr>
-          <w:rFonts w:ascii="Avenir Next LT Pro" w:hAnsi="Avenir Next LT Pro"/>
-          <w:i/>
-          <w:color w:val="303030"/>
-          <w:sz w:val="20"/>
-          <w:lang w:val="es-CO"/>
-        </w:rPr>
-        <w:t>.</w:t>
+        <w:t>XXXX.</w:t>
       </w:r>
       <w:bookmarkStart w:id="72" w:name="_Hlk101859364"/>
       <w:commentRangeEnd w:id="71"/>
@@ -7047,7 +6901,7 @@
         <w:t>METODOLOGÍA</w:t>
       </w:r>
       <w:r>
-        <w:t xml:space="preserve"> DEL MONITOREO</w:t>
+        <w:t> DEL MONITOREO</w:t>
       </w:r>
       <w:bookmarkEnd w:id="77"/>
     </w:p>
@@ -7086,7 +6940,7 @@
           <w:szCs w:val="22"/>
           <w:lang w:val="es-CO" w:eastAsia="es-CO"/>
         </w:rPr>
-        <w:t xml:space="preserve">El monitoreo se programó de acuerdo con los requerimientos de </w:t>
+        <w:t>El monitoreo se programó de acuerdo con los requerimientos de </w:t>
       </w:r>
       <w:r>
         <w:rPr>
@@ -7098,7 +6952,7 @@
           <w:szCs w:val="22"/>
           <w:lang w:val="es-CO" w:eastAsia="es-CO"/>
         </w:rPr>
-        <w:t>NOMBRE CLIENTE</w:t>
+        <w:t>{tag_nombre_cliente_met}</w:t>
       </w:r>
       <w:r>
         <w:rPr>
@@ -7108,7 +6962,7 @@
           <w:szCs w:val="22"/>
           <w:lang w:val="es-CO" w:eastAsia="es-CO"/>
         </w:rPr>
-        <w:t xml:space="preserve">, los cuales contemplaban la toma de muestras de agua </w:t>
+        <w:t>, los cuales contemplaban la toma de muestras de agua </w:t>
       </w:r>
       <w:r>
         <w:rPr>
@@ -7116,10 +6970,9 @@
           <w:color w:val="303030"/>
           <w:sz w:val="22"/>
           <w:szCs w:val="22"/>
-          <w:highlight w:val="cyan"/>
           <w:lang w:val="es-CO" w:eastAsia="es-CO"/>
         </w:rPr>
-        <w:t>{var_2}</w:t>
+        <w:t>{var_2} </w:t>
       </w:r>
       <w:r>
         <w:rPr>
@@ -7129,7 +6982,7 @@
           <w:szCs w:val="22"/>
           <w:lang w:val="es-CO" w:eastAsia="es-CO"/>
         </w:rPr>
-        <w:t xml:space="preserve"> </w:t>
+        <w:t>en {tag_num_puntos} puntos de monitoreo ubicados en la {tag_ciudad_dept_met}, con el propósito de evaluar sus características fisicoquímicas </w:t>
       </w:r>
       <w:r>
         <w:rPr>
@@ -7139,7 +6992,7 @@
           <w:szCs w:val="22"/>
           <w:lang w:val="es-CO" w:eastAsia="es-CO"/>
         </w:rPr>
-        <w:t xml:space="preserve">en XXX (XX) puntos de monitoreo ubicados en la ciudad/departamento, con el propósito de evaluar sus características fisicoquímicas </w:t>
+        <w:t>{nombre_cliente_los_cuales_contemplaban_la_toma_de__1}</w:t>
       </w:r>
       <w:r>
         <w:rPr>
@@ -7147,10 +7000,9 @@
           <w:color w:val="303030"/>
           <w:sz w:val="22"/>
           <w:szCs w:val="22"/>
-          <w:highlight w:val="cyan"/>
           <w:lang w:val="es-CO" w:eastAsia="es-CO"/>
         </w:rPr>
-        <w:t>{nombre_cliente_los_cuales_contemplaban_la_toma_de__1}</w:t>
+        <w:t>. No obstante, durante la visita de campo realizada el </w:t>
       </w:r>
       <w:r>
         <w:rPr>
@@ -7160,7 +7012,7 @@
           <w:szCs w:val="22"/>
           <w:lang w:val="es-CO" w:eastAsia="es-CO"/>
         </w:rPr>
-        <w:t xml:space="preserve">. No obstante, durante la visita de campo realizada el </w:t>
+        <w:t>{en_xxx_xx_puntos_de_monitoreo_ubicados_en_la_ciuda_1}</w:t>
       </w:r>
       <w:r>
         <w:rPr>
@@ -7168,10 +7020,9 @@
           <w:color w:val="303030"/>
           <w:sz w:val="22"/>
           <w:szCs w:val="22"/>
-          <w:highlight w:val="cyan"/>
           <w:lang w:val="es-CO" w:eastAsia="es-CO"/>
         </w:rPr>
-        <w:t>{en_xxx_xx_puntos_de_monitoreo_ubicados_en_la_ciuda_1}</w:t>
+        <w:t>, no fue posible efectuar la toma de muestras debido a que todos los puntos se </w:t>
       </w:r>
       <w:r>
         <w:rPr>
@@ -7181,7 +7032,7 @@
           <w:szCs w:val="22"/>
           <w:lang w:val="es-CO" w:eastAsia="es-CO"/>
         </w:rPr>
-        <w:t xml:space="preserve">, no fue posible efectuar la toma de muestras debido a que todos los puntos se </w:t>
+        <w:t>{en_xxx_xx_puntos_de_monitoreo_ubicados_en_la_ciuda_2}</w:t>
       </w:r>
       <w:r>
         <w:rPr>
@@ -7189,30 +7040,9 @@
           <w:color w:val="303030"/>
           <w:sz w:val="22"/>
           <w:szCs w:val="22"/>
-          <w:highlight w:val="cyan"/>
           <w:lang w:val="es-CO" w:eastAsia="es-CO"/>
         </w:rPr>
-        <w:t>{en_xxx_xx_puntos_de_monitoreo_ubicados_en_la_ciuda_2}</w:t>
-      </w:r>
-      <w:r>
-        <w:rPr>
-          <w:rFonts w:ascii="Avenir Next LT Pro" w:eastAsia="Times New Roman" w:hAnsi="Avenir Next LT Pro" w:cs="Times New Roman"/>
-          <w:color w:val="303030"/>
-          <w:sz w:val="22"/>
-          <w:szCs w:val="22"/>
-          <w:lang w:val="es-CO" w:eastAsia="es-CO"/>
-        </w:rPr>
-        <w:t>.</w:t>
-      </w:r>
-      <w:r>
-        <w:rPr>
-          <w:rFonts w:ascii="Avenir Next LT Pro" w:eastAsia="Times New Roman" w:hAnsi="Avenir Next LT Pro" w:cs="Times New Roman"/>
-          <w:color w:val="303030"/>
-          <w:sz w:val="22"/>
-          <w:szCs w:val="22"/>
-          <w:lang w:val="es-CO" w:eastAsia="es-CO"/>
-        </w:rPr>
-        <w:t xml:space="preserve"> A continuación, e</w:t>
+        <w:t>. A continuación, e</w:t>
       </w:r>
       <w:r>
         <w:rPr>
@@ -7221,7 +7051,7 @@
           <w:sz w:val="22"/>
           <w:szCs w:val="22"/>
         </w:rPr>
-        <w:t xml:space="preserve">n la </w:t>
+        <w:t>n la </w:t>
       </w:r>
       <w:r>
         <w:rPr>
@@ -7266,7 +7096,7 @@
           <w:sz w:val="22"/>
           <w:szCs w:val="22"/>
         </w:rPr>
-        <w:t xml:space="preserve">Tabla </w:t>
+        <w:t>Tabla </w:t>
       </w:r>
       <w:r>
         <w:rPr>
@@ -7295,7 +7125,7 @@
           <w:sz w:val="22"/>
           <w:szCs w:val="22"/>
         </w:rPr>
-        <w:t xml:space="preserve"> </w:t>
+        <w:t> </w:t>
       </w:r>
       <w:r>
         <w:rPr>
@@ -7304,7 +7134,7 @@
           <w:sz w:val="22"/>
           <w:szCs w:val="22"/>
         </w:rPr>
-        <w:t xml:space="preserve">se describen las características de la visita de campo. </w:t>
+        <w:t>se describen las características de la visita de campo. </w:t>
       </w:r>
     </w:p>
     <w:p>
@@ -7330,7 +7160,7 @@
           <w:sz w:val="20"/>
           <w:szCs w:val="20"/>
         </w:rPr>
-        <w:t xml:space="preserve">Tabla </w:t>
+        <w:t>Tabla </w:t>
       </w:r>
       <w:r>
         <w:rPr>
@@ -7427,7 +7257,6 @@
         <w:tc>
           <w:tcPr>
             <w:tcW w:w="1121" w:type="pct"/>
-            <w:shd w:val="clear" w:color="auto" w:fill="004CAB"/>
             <w:tcMar>
               <w:top w:w="15" w:type="dxa"/>
               <w:left w:w="15" w:type="dxa"/>
@@ -7465,7 +7294,6 @@
         <w:tc>
           <w:tcPr>
             <w:tcW w:w="1151" w:type="pct"/>
-            <w:shd w:val="clear" w:color="auto" w:fill="004CAB"/>
             <w:vAlign w:val="center"/>
           </w:tcPr>
           <w:p>
@@ -7496,7 +7324,6 @@
         <w:tc>
           <w:tcPr>
             <w:tcW w:w="2728" w:type="pct"/>
-            <w:shd w:val="clear" w:color="auto" w:fill="004CAB"/>
             <w:tcMar>
               <w:top w:w="15" w:type="dxa"/>
               <w:left w:w="15" w:type="dxa"/>
@@ -7539,7 +7366,6 @@
         <w:tc>
           <w:tcPr>
             <w:tcW w:w="1121" w:type="pct"/>
-            <w:shd w:val="clear" w:color="auto" w:fill="auto"/>
             <w:tcMar>
               <w:top w:w="15" w:type="dxa"/>
               <w:left w:w="15" w:type="dxa"/>
@@ -7581,7 +7407,6 @@
         <w:tc>
           <w:tcPr>
             <w:tcW w:w="2728" w:type="pct"/>
-            <w:shd w:val="clear" w:color="auto" w:fill="auto"/>
             <w:tcMar>
               <w:top w:w="15" w:type="dxa"/>
               <w:left w:w="15" w:type="dxa"/>
@@ -7623,7 +7448,6 @@
           <w:i/>
           <w:color w:val="303030"/>
           <w:sz w:val="20"/>
-          <w:highlight w:val="cyan"/>
           <w:lang w:val="es-CO"/>
         </w:rPr>
         <w:t>{var_4}</w:t>
@@ -7634,7 +7458,6 @@
           <w:color w:val="303030"/>
           <w:sz w:val="20"/>
           <w:szCs w:val="20"/>
-          <w:highlight w:val="cyan"/>
           <w:lang w:val="es-CO" w:eastAsia="es-CO"/>
         </w:rPr>
       </w:r>
@@ -7644,7 +7467,6 @@
           <w:i/>
           <w:color w:val="303030"/>
           <w:sz w:val="20"/>
-          <w:highlight w:val="cyan"/>
           <w:lang w:val="es-CO"/>
         </w:rPr>
       </w:r>
@@ -7654,7 +7476,6 @@
           <w:i/>
           <w:color w:val="303030"/>
           <w:sz w:val="20"/>
-          <w:highlight w:val="cyan"/>
           <w:lang w:val="es-CO"/>
         </w:rPr>
       </w:r>
@@ -7664,7 +7485,6 @@
           <w:i/>
           <w:color w:val="303030"/>
           <w:sz w:val="20"/>
-          <w:highlight w:val="cyan"/>
           <w:lang w:val="es-CO"/>
         </w:rPr>
       </w:r>
@@ -7678,7 +7498,7 @@
       <w:bookmarkStart w:id="85" w:name="_Toc19781417"/>
       <w:bookmarkStart w:id="86" w:name="_Toc214355444"/>
       <w:r>
-        <w:t xml:space="preserve">Descripción </w:t>
+        <w:t>Descripción </w:t>
       </w:r>
       <w:commentRangeStart w:id="87"/>
       <w:r>
@@ -7688,7 +7508,7 @@
         <w:t>l</w:t>
       </w:r>
       <w:r>
-        <w:t xml:space="preserve"> punto de </w:t>
+        <w:t> punto de </w:t>
       </w:r>
       <w:commentRangeEnd w:id="87"/>
       <w:r>
@@ -7723,14 +7543,13 @@
           <w:sz w:val="22"/>
           <w:lang w:val="es-CO"/>
         </w:rPr>
-        <w:t xml:space="preserve">A continuación, se presenta la descripción </w:t>
+        <w:t>A continuación, se presenta la descripción </w:t>
       </w:r>
       <w:r>
         <w:rPr>
           <w:rFonts w:ascii="Avenir Next LT Pro" w:hAnsi="Avenir Next LT Pro" w:cstheme="majorHAnsi"/>
           <w:color w:val="303030"/>
           <w:sz w:val="22"/>
-          <w:highlight w:val="yellow"/>
           <w:lang w:val="es-CO"/>
         </w:rPr>
         <w:t>del</w:t>
@@ -7740,17 +7559,15 @@
           <w:rFonts w:ascii="Avenir Next LT Pro" w:hAnsi="Avenir Next LT Pro" w:cstheme="majorHAnsi"/>
           <w:color w:val="303030"/>
           <w:sz w:val="22"/>
-          <w:highlight w:val="yellow"/>
-          <w:lang w:val="es-CO"/>
-        </w:rPr>
-        <w:t xml:space="preserve"> punto de monitoreo, </w:t>
+          <w:lang w:val="es-CO"/>
+        </w:rPr>
+        <w:t> punto de monitoreo, </w:t>
       </w:r>
       <w:r>
         <w:rPr>
           <w:rFonts w:ascii="Avenir Next LT Pro" w:hAnsi="Avenir Next LT Pro" w:cstheme="majorHAnsi"/>
           <w:color w:val="303030"/>
           <w:sz w:val="22"/>
-          <w:highlight w:val="yellow"/>
           <w:lang w:val="es-CO"/>
         </w:rPr>
         <w:t>el cual se encuentra</w:t>
@@ -7760,10 +7577,9 @@
           <w:rFonts w:ascii="Avenir Next LT Pro" w:hAnsi="Avenir Next LT Pro" w:cstheme="majorHAnsi"/>
           <w:color w:val="303030"/>
           <w:sz w:val="22"/>
-          <w:highlight w:val="yellow"/>
-          <w:lang w:val="es-CO"/>
-        </w:rPr>
-        <w:t xml:space="preserve"> relacionado</w:t>
+          <w:lang w:val="es-CO"/>
+        </w:rPr>
+        <w:t> relacionado</w:t>
       </w:r>
       <w:r>
         <w:rPr>
@@ -7772,7 +7588,7 @@
           <w:sz w:val="22"/>
           <w:lang w:val="es-CO"/>
         </w:rPr>
-        <w:t xml:space="preserve"> en el </w:t>
+        <w:t> en el </w:t>
       </w:r>
       <w:r>
         <w:rPr>
@@ -7791,7 +7607,7 @@
           <w:sz w:val="22"/>
           <w:lang w:val="es-CO"/>
         </w:rPr>
-        <w:t xml:space="preserve">, </w:t>
+        <w:t>, </w:t>
       </w:r>
       <w:r>
         <w:rPr>
@@ -7810,7 +7626,7 @@
           <w:sz w:val="22"/>
           <w:lang w:val="es-CO"/>
         </w:rPr>
-        <w:t xml:space="preserve"> (p</w:t>
+        <w:t> (p</w:t>
       </w:r>
       <w:r>
         <w:rPr>
@@ -7818,7 +7634,6 @@
           <w:i/>
           <w:color w:val="303030"/>
           <w:sz w:val="22"/>
-          <w:highlight w:val="cyan"/>
           <w:lang w:val="es-CO"/>
         </w:rPr>
         <w:t>{en_el_anexo_2_formatos_de_campo_p_1}</w:t>
@@ -7829,7 +7644,6 @@
           <w:i/>
           <w:color w:val="303030"/>
           <w:sz w:val="22"/>
-          <w:highlight w:val="cyan"/>
           <w:lang w:val="es-CO"/>
         </w:rPr>
       </w:r>
@@ -7839,7 +7653,6 @@
           <w:i/>
           <w:color w:val="303030"/>
           <w:sz w:val="22"/>
-          <w:highlight w:val="cyan"/>
           <w:lang w:val="es-CO"/>
         </w:rPr>
       </w:r>
@@ -7849,7 +7662,6 @@
           <w:i/>
           <w:color w:val="303030"/>
           <w:sz w:val="22"/>
-          <w:highlight w:val="cyan"/>
           <w:lang w:val="es-CO"/>
         </w:rPr>
       </w:r>
@@ -7859,7 +7671,6 @@
           <w:i/>
           <w:color w:val="303030"/>
           <w:sz w:val="22"/>
-          <w:highlight w:val="cyan"/>
           <w:lang w:val="es-CO"/>
         </w:rPr>
       </w:r>
@@ -7870,7 +7681,6 @@
           <w:i/>
           <w:color w:val="303030"/>
           <w:sz w:val="22"/>
-          <w:highlight w:val="cyan"/>
           <w:lang w:val="es-CO"/>
         </w:rPr>
       </w:r>
@@ -7880,7 +7690,6 @@
           <w:i/>
           <w:color w:val="303030"/>
           <w:sz w:val="22"/>
-          <w:highlight w:val="cyan"/>
           <w:lang w:val="es-CO"/>
         </w:rPr>
       </w:r>
@@ -7890,7 +7699,6 @@
           <w:i/>
           <w:color w:val="303030"/>
           <w:sz w:val="22"/>
-          <w:highlight w:val="cyan"/>
           <w:lang w:val="es-CO"/>
         </w:rPr>
       </w:r>
@@ -7912,7 +7720,7 @@
           <w:sz w:val="22"/>
           <w:lang w:val="es-CO"/>
         </w:rPr>
-        <w:t xml:space="preserve"> </w:t>
+        <w:t> </w:t>
       </w:r>
       <w:commentRangeEnd w:id="91"/>
       <w:r>
@@ -7931,7 +7739,7 @@
           <w:sz w:val="22"/>
           <w:lang w:val="es-CO"/>
         </w:rPr>
-        <w:t xml:space="preserve"> </w:t>
+        <w:t> </w:t>
       </w:r>
       <w:bookmarkStart w:id="92" w:name="_Ref7187261"/>
     </w:p>
@@ -7959,7 +7767,7 @@
           <w:szCs w:val="20"/>
           <w:lang w:val="es-CO"/>
         </w:rPr>
-        <w:t xml:space="preserve">Tabla </w:t>
+        <w:t>Tabla </w:t>
       </w:r>
       <w:r>
         <w:rPr>
@@ -8032,7 +7840,7 @@
           <w:szCs w:val="20"/>
           <w:lang w:val="es-CO"/>
         </w:rPr>
-        <w:t xml:space="preserve">. Descripción </w:t>
+        <w:t>. Descripción </w:t>
       </w:r>
       <w:commentRangeStart w:id="96"/>
       <w:r>
@@ -8069,7 +7877,7 @@
           <w:szCs w:val="20"/>
           <w:lang w:val="es-CO"/>
         </w:rPr>
-        <w:t xml:space="preserve"> punto de monitoreo u</w:t>
+        <w:t> punto de monitoreo u</w:t>
       </w:r>
       <w:r>
         <w:rPr>
@@ -8093,7 +7901,7 @@
           <w:szCs w:val="20"/>
           <w:lang w:val="es-CO"/>
         </w:rPr>
-        <w:t xml:space="preserve"> </w:t>
+        <w:t> </w:t>
       </w:r>
       <w:commentRangeEnd w:id="96"/>
       <w:r>
@@ -8166,7 +7974,6 @@
           <w:tcPr>
             <w:tcW w:w="5000" w:type="pct"/>
             <w:gridSpan w:val="3"/>
-            <w:shd w:val="clear" w:color="auto" w:fill="004CAB"/>
             <w:vAlign w:val="center"/>
             <w:hideMark/>
           </w:tcPr>
@@ -8191,7 +7998,6 @@
                 <w:color w:val="FFFFFF" w:themeColor="background1"/>
                 <w:sz w:val="20"/>
                 <w:szCs w:val="20"/>
-                <w:highlight w:val="cyan"/>
                 <w:lang w:val="es-CO" w:eastAsia="es-CO"/>
               </w:rPr>
               <w:t>{var_8}</w:t>
@@ -8208,7 +8014,6 @@
         <w:tc>
           <w:tcPr>
             <w:tcW w:w="245" w:type="pct"/>
-            <w:shd w:val="clear" w:color="auto" w:fill="004CAB"/>
             <w:textDirection w:val="btLr"/>
             <w:vAlign w:val="center"/>
             <w:hideMark/>
@@ -8244,7 +8049,6 @@
           <w:tcPr>
             <w:tcW w:w="4755" w:type="pct"/>
             <w:gridSpan w:val="2"/>
-            <w:shd w:val="clear" w:color="auto" w:fill="auto"/>
             <w:vAlign w:val="center"/>
             <w:hideMark/>
           </w:tcPr>
@@ -8270,7 +8074,6 @@
                 <w:b/>
                 <w:bCs/>
                 <w:color w:val="303030"/>
-                <w:highlight w:val="cyan"/>
               </w:rPr>
               <w:t>{var_10}</w:t>
             </w:r>
@@ -8280,21 +8083,18 @@
                 <w:b/>
                 <w:bCs/>
                 <w:color w:val="303030"/>
-                <w:highlight w:val="cyan"/>
               </w:rPr>
             </w:r>
             <w:r>
               <w:rPr>
                 <w:rFonts w:ascii="Avenir Next LT Pro" w:hAnsi="Avenir Next LT Pro" w:cs="Calibri"/>
                 <w:color w:val="303030"/>
-                <w:highlight w:val="cyan"/>
               </w:rPr>
             </w:r>
             <w:r>
               <w:rPr>
                 <w:rFonts w:ascii="Avenir Next LT Pro" w:hAnsi="Avenir Next LT Pro" w:cs="Calibri"/>
                 <w:color w:val="303030"/>
-                <w:highlight w:val="cyan"/>
               </w:rPr>
             </w:r>
           </w:p>
@@ -8310,7 +8110,6 @@
           <w:tcPr>
             <w:tcW w:w="245" w:type="pct"/>
             <w:vMerge w:val="restart"/>
-            <w:shd w:val="clear" w:color="auto" w:fill="004CAB"/>
             <w:textDirection w:val="btLr"/>
             <w:vAlign w:val="center"/>
           </w:tcPr>
@@ -8344,7 +8143,6 @@
         <w:tc>
           <w:tcPr>
             <w:tcW w:w="2387" w:type="pct"/>
-            <w:shd w:val="clear" w:color="auto" w:fill="auto"/>
             <w:vAlign w:val="center"/>
           </w:tcPr>
           <w:p>
@@ -8366,7 +8164,7 @@
                 <w:szCs w:val="20"/>
                 <w:lang w:val="es-CO"/>
               </w:rPr>
-              <w:t>Aquí se adjuntan las fotos (georreferenciadas en el caso que aplique)</w:t>
+              <w:t>{tag_foto_placeholder}</w:t>
             </w:r>
           </w:p>
           <w:p>
@@ -8377,7 +8175,6 @@
                 <w:b/>
                 <w:bCs/>
                 <w:color w:val="303030"/>
-                <w:highlight w:val="cyan"/>
               </w:rPr>
             </w:pPr>
           </w:p>
@@ -8385,7 +8182,6 @@
         <w:tc>
           <w:tcPr>
             <w:tcW w:w="2368" w:type="pct"/>
-            <w:shd w:val="clear" w:color="auto" w:fill="auto"/>
             <w:vAlign w:val="center"/>
           </w:tcPr>
           <w:p>
@@ -8407,7 +8203,7 @@
                 <w:szCs w:val="20"/>
                 <w:lang w:val="es-CO"/>
               </w:rPr>
-              <w:t>Aquí se adjuntan las fotos (georreferenciadas en el caso que aplique)</w:t>
+              <w:t>{tag_foto_placeholder}</w:t>
             </w:r>
           </w:p>
           <w:p>
@@ -8418,7 +8214,6 @@
                 <w:b/>
                 <w:bCs/>
                 <w:color w:val="303030"/>
-                <w:highlight w:val="cyan"/>
               </w:rPr>
             </w:pPr>
           </w:p>
@@ -8434,7 +8229,6 @@
           <w:tcPr>
             <w:tcW w:w="245" w:type="pct"/>
             <w:vMerge/>
-            <w:shd w:val="clear" w:color="auto" w:fill="004CAB"/>
             <w:textDirection w:val="btLr"/>
             <w:vAlign w:val="center"/>
             <w:hideMark/>
@@ -8457,7 +8251,6 @@
         <w:tc>
           <w:tcPr>
             <w:tcW w:w="2387" w:type="pct"/>
-            <w:shd w:val="clear" w:color="auto" w:fill="auto"/>
             <w:hideMark/>
           </w:tcPr>
           <w:p>
@@ -8486,7 +8279,7 @@
                 <w:szCs w:val="20"/>
                 <w:lang w:val="es-CO"/>
               </w:rPr>
-              <w:t xml:space="preserve">Fotografía </w:t>
+              <w:t>Fotografía </w:t>
             </w:r>
             <w:r>
               <w:rPr>
@@ -8559,19 +8352,7 @@
                 <w:szCs w:val="20"/>
                 <w:lang w:val="es-CO"/>
               </w:rPr>
-              <w:t xml:space="preserve">. </w:t>
-            </w:r>
-            <w:r>
-              <w:rPr>
-                <w:rFonts w:ascii="Avenir Next LT Pro" w:hAnsi="Avenir Next LT Pro" w:cs="Calibri"/>
-                <w:b/>
-                <w:bCs/>
-                <w:color w:val="303030"/>
-                <w:sz w:val="20"/>
-                <w:szCs w:val="20"/>
-                <w:lang w:val="es-CO"/>
-              </w:rPr>
-              <w:t>XXXX</w:t>
+              <w:t>. XXXX</w:t>
             </w:r>
             <w:bookmarkEnd w:id="97"/>
           </w:p>
@@ -8579,7 +8360,6 @@
         <w:tc>
           <w:tcPr>
             <w:tcW w:w="2368" w:type="pct"/>
-            <w:shd w:val="clear" w:color="auto" w:fill="auto"/>
           </w:tcPr>
           <w:p>
             <w:pPr>
@@ -8607,7 +8387,7 @@
                 <w:szCs w:val="20"/>
                 <w:lang w:val="es-CO"/>
               </w:rPr>
-              <w:t xml:space="preserve">Fotografía </w:t>
+              <w:t>Fotografía </w:t>
             </w:r>
             <w:r>
               <w:rPr>
@@ -8680,7 +8460,7 @@
                 <w:szCs w:val="20"/>
                 <w:lang w:val="es-CO"/>
               </w:rPr>
-              <w:t xml:space="preserve">. </w:t>
+              <w:t>. </w:t>
             </w:r>
             <w:commentRangeStart w:id="99"/>
             <w:r>
@@ -8731,7 +8511,7 @@
           <w:szCs w:val="20"/>
           <w:lang w:val="es-CO"/>
         </w:rPr>
-        <w:t xml:space="preserve">Fuente: SERAMBIENTE S.A.S., </w:t>
+        <w:t>Fuente: SERAMBIENTE S.A.S., </w:t>
       </w:r>
       <w:commentRangeStart w:id="100"/>
       <w:r>
@@ -8775,7 +8555,6 @@
           <w:color w:val="303030"/>
           <w:sz w:val="20"/>
           <w:szCs w:val="20"/>
-          <w:highlight w:val="yellow"/>
           <w:lang w:val="es-CO"/>
         </w:rPr>
       </w:pPr>
@@ -8786,7 +8565,6 @@
           <w:color w:val="303030"/>
           <w:sz w:val="20"/>
           <w:szCs w:val="20"/>
-          <w:highlight w:val="yellow"/>
           <w:lang w:val="es-CO"/>
         </w:rPr>
         <w:br w:type="page"/>
@@ -8805,7 +8583,7 @@
           <w:lang w:eastAsia="es-MX"/>
         </w:rPr>
         <w:lastRenderedPageBreak/>
-        <w:t xml:space="preserve">Ubicación </w:t>
+        <w:t>Ubicación </w:t>
       </w:r>
       <w:commentRangeStart w:id="102"/>
       <w:r>
@@ -8824,7 +8602,7 @@
         <w:rPr>
           <w:lang w:eastAsia="es-MX"/>
         </w:rPr>
-        <w:t xml:space="preserve"> punto de </w:t>
+        <w:t> punto de </w:t>
       </w:r>
       <w:commentRangeEnd w:id="102"/>
       <w:r>
@@ -8890,7 +8668,7 @@
           <w:szCs w:val="22"/>
           <w:lang w:val="es-CO"/>
         </w:rPr>
-        <w:t xml:space="preserve"> de monitore</w:t>
+        <w:t> de monitore</w:t>
       </w:r>
       <w:r>
         <w:rPr>
@@ -8910,7 +8688,7 @@
           <w:szCs w:val="22"/>
           <w:lang w:val="es-CO"/>
         </w:rPr>
-        <w:t xml:space="preserve">, </w:t>
+        <w:t>, </w:t>
       </w:r>
       <w:r>
         <w:rPr>
@@ -8920,7 +8698,7 @@
           <w:szCs w:val="22"/>
           <w:lang w:val="es-ES" w:eastAsia="en-US"/>
         </w:rPr>
-        <w:t xml:space="preserve">realizado </w:t>
+        <w:t>realizado </w:t>
       </w:r>
       <w:r>
         <w:rPr>
@@ -8930,7 +8708,7 @@
           <w:szCs w:val="22"/>
           <w:lang w:val="es-CO"/>
         </w:rPr>
-        <w:t xml:space="preserve">en el </w:t>
+        <w:t>en el </w:t>
       </w:r>
       <w:r>
         <w:rPr>
@@ -8938,7 +8716,6 @@
           <w:color w:val="303030"/>
           <w:sz w:val="22"/>
           <w:szCs w:val="22"/>
-          <w:highlight w:val="cyan"/>
           <w:lang w:val="es-CO"/>
         </w:rPr>
         <w:t>{de_monitoreo_realizado_en_el_1}</w:t>
@@ -8949,7 +8726,6 @@
           <w:color w:val="303030"/>
           <w:sz w:val="22"/>
           <w:szCs w:val="22"/>
-          <w:highlight w:val="cyan"/>
           <w:lang w:val="es-CO"/>
         </w:rPr>
       </w:r>
@@ -8959,7 +8735,6 @@
           <w:color w:val="303030"/>
           <w:sz w:val="22"/>
           <w:szCs w:val="22"/>
-          <w:highlight w:val="cyan"/>
           <w:lang w:val="es-CO"/>
         </w:rPr>
       </w:r>
@@ -8969,7 +8744,6 @@
           <w:color w:val="303030"/>
           <w:sz w:val="22"/>
           <w:szCs w:val="22"/>
-          <w:highlight w:val="cyan"/>
           <w:lang w:val="es-CO"/>
         </w:rPr>
       </w:r>
@@ -8980,7 +8754,6 @@
           <w:color w:val="303030"/>
           <w:sz w:val="22"/>
           <w:szCs w:val="22"/>
-          <w:highlight w:val="cyan"/>
           <w:lang w:val="es-CO"/>
         </w:rPr>
       </w:r>
@@ -8993,7 +8766,7 @@
           <w:szCs w:val="22"/>
           <w:lang w:val="es-CO"/>
         </w:rPr>
-        <w:t xml:space="preserve"> </w:t>
+        <w:t> </w:t>
       </w:r>
     </w:p>
     <w:p>
@@ -9014,7 +8787,6 @@
           <w:color w:val="303030"/>
           <w:sz w:val="22"/>
           <w:szCs w:val="22"/>
-          <w:highlight w:val="cyan"/>
           <w:lang w:val="es-CO"/>
         </w:rPr>
         <w:t>{tiene_un_clima_tropical_en_comparacion_con_el_invi_1}</w:t>
@@ -9027,7 +8799,7 @@
           <w:szCs w:val="22"/>
           <w:lang w:val="es-CO"/>
         </w:rPr>
-        <w:t xml:space="preserve"> tiene un clima tropical. En comparación con el invierno, los veranos tienen mucha más lluvia. De acuerdo con Köppen y Geiger clima se clasifica como </w:t>
+        <w:t> tiene un clima tropical. En comparación con el invierno, los veranos tienen mucha más lluvia. De acuerdo con Köppen y Geiger clima se clasifica como </w:t>
       </w:r>
       <w:proofErr w:type="spellStart"/>
       <w:r>
@@ -9049,7 +8821,7 @@
           <w:szCs w:val="22"/>
           <w:lang w:val="es-CO"/>
         </w:rPr>
-        <w:t xml:space="preserve">. En </w:t>
+        <w:t>. En </w:t>
       </w:r>
       <w:r>
         <w:rPr>
@@ -9057,7 +8829,6 @@
           <w:color w:val="303030"/>
           <w:sz w:val="22"/>
           <w:szCs w:val="22"/>
-          <w:highlight w:val="cyan"/>
           <w:lang w:val="es-CO"/>
         </w:rPr>
         <w:t>{tiene_un_clima_tropical_en_comparacion_con_el_invi_2}</w:t>
@@ -9068,7 +8839,6 @@
           <w:color w:val="303030"/>
           <w:sz w:val="22"/>
           <w:szCs w:val="22"/>
-          <w:highlight w:val="cyan"/>
           <w:lang w:val="es-CO"/>
         </w:rPr>
       </w:r>
@@ -9080,7 +8850,7 @@
           <w:szCs w:val="22"/>
           <w:lang w:val="es-CO"/>
         </w:rPr>
-        <w:t xml:space="preserve"> la temperatura media anual es de </w:t>
+        <w:t> la temperatura media anual es de </w:t>
       </w:r>
       <w:r>
         <w:rPr>
@@ -9100,7 +8870,7 @@
           <w:szCs w:val="22"/>
           <w:lang w:val="es-CO"/>
         </w:rPr>
-        <w:t xml:space="preserve"> °C. En un año, la precipitación es </w:t>
+        <w:t> °C. En un año, la precipitación es </w:t>
       </w:r>
       <w:r>
         <w:rPr>
@@ -9120,7 +8890,7 @@
           <w:szCs w:val="22"/>
           <w:lang w:val="es-CO"/>
         </w:rPr>
-        <w:t xml:space="preserve"> </w:t>
+        <w:t> </w:t>
       </w:r>
       <w:proofErr w:type="spellStart"/>
       <w:r>
@@ -9141,7 +8911,6 @@
             <w:color w:val="303030"/>
             <w:sz w:val="22"/>
             <w:szCs w:val="22"/>
-            <w:highlight w:val="cyan"/>
             <w:lang w:val="es-CO"/>
           </w:rPr>
           <w:id w:val="288567315"/>
@@ -9154,7 +8923,6 @@
               <w:color w:val="303030"/>
               <w:sz w:val="22"/>
               <w:szCs w:val="22"/>
-              <w:highlight w:val="cyan"/>
               <w:lang w:val="es-CO"/>
             </w:rPr>
             <w:fldChar w:fldCharType="begin"/>
@@ -9165,7 +8933,6 @@
               <w:color w:val="303030"/>
               <w:sz w:val="22"/>
               <w:szCs w:val="22"/>
-              <w:highlight w:val="cyan"/>
               <w:lang w:val="es-CO"/>
             </w:rPr>
             <w:instrText xml:space="preserve">CITATION CLI20 \l 3082 </w:instrText>
@@ -9176,7 +8943,6 @@
               <w:color w:val="303030"/>
               <w:sz w:val="22"/>
               <w:szCs w:val="22"/>
-              <w:highlight w:val="cyan"/>
               <w:lang w:val="es-CO"/>
             </w:rPr>
             <w:fldChar w:fldCharType="separate"/>
@@ -9188,10 +8954,9 @@
               <w:color w:val="303030"/>
               <w:sz w:val="22"/>
               <w:szCs w:val="22"/>
-              <w:highlight w:val="cyan"/>
               <w:lang w:val="es-CO"/>
             </w:rPr>
-            <w:t xml:space="preserve"> </w:t>
+            <w:t> </w:t>
           </w:r>
           <w:r>
             <w:rPr>
@@ -9200,7 +8965,6 @@
               <w:color w:val="303030"/>
               <w:sz w:val="22"/>
               <w:szCs w:val="22"/>
-              <w:highlight w:val="cyan"/>
               <w:lang w:val="es-CO"/>
             </w:rPr>
             <w:t>(Climate-data.org, 2021)</w:t>
@@ -9211,7 +8975,6 @@
               <w:color w:val="303030"/>
               <w:sz w:val="22"/>
               <w:szCs w:val="22"/>
-              <w:highlight w:val="cyan"/>
               <w:lang w:val="es-CO"/>
             </w:rPr>
             <w:fldChar w:fldCharType="end"/>
@@ -9224,7 +8987,6 @@
           <w:color w:val="303030"/>
           <w:sz w:val="22"/>
           <w:szCs w:val="22"/>
-          <w:highlight w:val="cyan"/>
           <w:lang w:val="es-CO"/>
         </w:rPr>
         <w:t>.</w:t>
@@ -9237,7 +8999,7 @@
           <w:szCs w:val="22"/>
           <w:lang w:val="es-CO"/>
         </w:rPr>
-        <w:t xml:space="preserve"> </w:t>
+        <w:t> </w:t>
       </w:r>
     </w:p>
     <w:p>
@@ -9286,7 +9048,7 @@
           <w:szCs w:val="22"/>
           <w:lang w:val="es-CO"/>
         </w:rPr>
-        <w:t xml:space="preserve"> de acuerdo con el sistema de coordenadas geográficas WGS84 y</w:t>
+        <w:t> de acuerdo con el sistema de coordenadas geográficas WGS84 y</w:t>
       </w:r>
       <w:r>
         <w:rPr>
@@ -9296,7 +9058,7 @@
           <w:szCs w:val="22"/>
           <w:lang w:val="es-CO"/>
         </w:rPr>
-        <w:t xml:space="preserve"> coordenadas</w:t>
+        <w:t> coordenadas</w:t>
       </w:r>
       <w:r>
         <w:rPr>
@@ -9306,7 +9068,7 @@
           <w:szCs w:val="22"/>
           <w:lang w:val="es-CO"/>
         </w:rPr>
-        <w:t xml:space="preserve"> </w:t>
+        <w:t> </w:t>
       </w:r>
       <w:r>
         <w:rPr>
@@ -9316,7 +9078,7 @@
           <w:szCs w:val="22"/>
           <w:lang w:val="es-CO"/>
         </w:rPr>
-        <w:t xml:space="preserve">planas </w:t>
+        <w:t>planas </w:t>
       </w:r>
       <w:r>
         <w:rPr>
@@ -9326,7 +9088,7 @@
           <w:szCs w:val="22"/>
           <w:lang w:val="es-CO"/>
         </w:rPr>
-        <w:t xml:space="preserve">Magna Sirgas con origen </w:t>
+        <w:t>Magna Sirgas con origen </w:t>
       </w:r>
       <w:r>
         <w:rPr>
@@ -9356,7 +9118,7 @@
           <w:szCs w:val="22"/>
           <w:lang w:val="es-CO"/>
         </w:rPr>
-        <w:t xml:space="preserve"> </w:t>
+        <w:t> </w:t>
       </w:r>
       <w:r>
         <w:rPr>
@@ -9421,7 +9183,7 @@
           <w:szCs w:val="22"/>
           <w:lang w:val="es-CO"/>
         </w:rPr>
-        <w:t xml:space="preserve">Tabla </w:t>
+        <w:t>Tabla </w:t>
       </w:r>
       <w:r>
         <w:rPr>
@@ -9456,7 +9218,7 @@
           <w:szCs w:val="22"/>
           <w:lang w:val="es-CO"/>
         </w:rPr>
-        <w:t xml:space="preserve"> </w:t>
+        <w:t> </w:t>
       </w:r>
       <w:r>
         <w:rPr>
@@ -9476,7 +9238,7 @@
           <w:szCs w:val="22"/>
           <w:lang w:val="es-CO"/>
         </w:rPr>
-        <w:t xml:space="preserve"> geográfica en la </w:t>
+        <w:t> geográfica en la </w:t>
       </w:r>
       <w:r>
         <w:rPr>
@@ -9535,7 +9297,7 @@
           <w:szCs w:val="22"/>
           <w:lang w:val="es-CO"/>
         </w:rPr>
-        <w:t xml:space="preserve">Figura </w:t>
+        <w:t>Figura </w:t>
       </w:r>
       <w:r>
         <w:rPr>
@@ -9602,7 +9364,7 @@
           <w:szCs w:val="20"/>
           <w:lang w:val="es-CO"/>
         </w:rPr>
-        <w:t xml:space="preserve">Tabla </w:t>
+        <w:t>Tabla </w:t>
       </w:r>
       <w:r>
         <w:rPr>
@@ -9676,7 +9438,7 @@
           <w:szCs w:val="20"/>
           <w:lang w:val="es-CO"/>
         </w:rPr>
-        <w:t xml:space="preserve">. Ubicación geográfica </w:t>
+        <w:t>. Ubicación geográfica </w:t>
       </w:r>
       <w:commentRangeStart w:id="107"/>
       <w:r>
@@ -9713,7 +9475,7 @@
           <w:szCs w:val="20"/>
           <w:lang w:val="es-CO"/>
         </w:rPr>
-        <w:t xml:space="preserve"> punto</w:t>
+        <w:t> punto</w:t>
       </w:r>
       <w:commentRangeEnd w:id="107"/>
       <w:r>
@@ -9735,7 +9497,7 @@
           <w:szCs w:val="20"/>
           <w:lang w:val="es-CO"/>
         </w:rPr>
-        <w:t xml:space="preserve"> de monitoreo</w:t>
+        <w:t> de monitoreo</w:t>
       </w:r>
       <w:r>
         <w:rPr>
@@ -9787,7 +9549,6 @@
           <w:tcPr>
             <w:tcW w:w="2968" w:type="pct"/>
             <w:gridSpan w:val="4"/>
-            <w:shd w:val="clear" w:color="auto" w:fill="004CAB"/>
             <w:noWrap/>
             <w:vAlign w:val="center"/>
             <w:hideMark/>
@@ -9823,7 +9584,6 @@
           <w:tcPr>
             <w:tcW w:w="2032" w:type="pct"/>
             <w:gridSpan w:val="2"/>
-            <w:shd w:val="clear" w:color="auto" w:fill="004CAB"/>
             <w:noWrap/>
             <w:vAlign w:val="center"/>
             <w:hideMark/>
@@ -9863,7 +9623,6 @@
         <w:tc>
           <w:tcPr>
             <w:tcW w:w="1040" w:type="pct"/>
-            <w:shd w:val="clear" w:color="auto" w:fill="004CAB"/>
             <w:vAlign w:val="center"/>
             <w:hideMark/>
           </w:tcPr>
@@ -9897,7 +9656,6 @@
         <w:tc>
           <w:tcPr>
             <w:tcW w:w="642" w:type="pct"/>
-            <w:shd w:val="clear" w:color="auto" w:fill="004CAB"/>
             <w:vAlign w:val="center"/>
             <w:hideMark/>
           </w:tcPr>
@@ -9931,7 +9689,6 @@
         <w:tc>
           <w:tcPr>
             <w:tcW w:w="690" w:type="pct"/>
-            <w:shd w:val="clear" w:color="auto" w:fill="004CAB"/>
             <w:vAlign w:val="center"/>
             <w:hideMark/>
           </w:tcPr>
@@ -9991,7 +9748,6 @@
         <w:tc>
           <w:tcPr>
             <w:tcW w:w="595" w:type="pct"/>
-            <w:shd w:val="clear" w:color="auto" w:fill="004CAB"/>
             <w:vAlign w:val="center"/>
             <w:hideMark/>
           </w:tcPr>
@@ -10049,7 +9805,6 @@
         <w:tc>
           <w:tcPr>
             <w:tcW w:w="1044" w:type="pct"/>
-            <w:shd w:val="clear" w:color="auto" w:fill="004CAB"/>
             <w:vAlign w:val="center"/>
             <w:hideMark/>
           </w:tcPr>
@@ -10083,7 +9838,6 @@
         <w:tc>
           <w:tcPr>
             <w:tcW w:w="988" w:type="pct"/>
-            <w:shd w:val="clear" w:color="auto" w:fill="004CAB"/>
             <w:vAlign w:val="center"/>
             <w:hideMark/>
           </w:tcPr>
@@ -10122,7 +9876,7 @@
                 <w:szCs w:val="20"/>
                 <w:lang w:val="es-CO" w:eastAsia="es-CO"/>
               </w:rPr>
-              <w:t xml:space="preserve"> (m)</w:t>
+              <w:t> (m)</w:t>
             </w:r>
           </w:p>
         </w:tc>
@@ -10135,7 +9889,6 @@
           <w:tcPr>
             <w:tcW w:w="1040" w:type="pct"/>
             <w:vMerge w:val="restart"/>
-            <w:shd w:val="clear" w:color="auto" w:fill="auto"/>
             <w:vAlign w:val="center"/>
             <w:hideMark/>
           </w:tcPr>
@@ -10147,7 +9900,6 @@
                 <w:color w:val="303030"/>
                 <w:sz w:val="20"/>
                 <w:szCs w:val="20"/>
-                <w:highlight w:val="cyan"/>
                 <w:lang w:val="es-CO" w:eastAsia="es-CO"/>
               </w:rPr>
             </w:pPr>
@@ -10156,7 +9908,6 @@
                 <w:rFonts w:ascii="Avenir Next LT Pro" w:hAnsi="Avenir Next LT Pro" w:cs="Calibri"/>
                 <w:color w:val="303030"/>
                 <w:sz w:val="20"/>
-                <w:highlight w:val="cyan"/>
                 <w:lang w:val="es-CO"/>
               </w:rPr>
               <w:t>{var_15}</w:t>
@@ -10166,7 +9917,6 @@
                 <w:rFonts w:ascii="Avenir Next LT Pro" w:hAnsi="Avenir Next LT Pro" w:cs="Calibri"/>
                 <w:color w:val="303030"/>
                 <w:sz w:val="20"/>
-                <w:highlight w:val="cyan"/>
                 <w:lang w:val="es-CO"/>
               </w:rPr>
             </w:r>
@@ -10176,7 +9926,6 @@
           <w:tcPr>
             <w:tcW w:w="642" w:type="pct"/>
             <w:vMerge w:val="restart"/>
-            <w:shd w:val="clear" w:color="auto" w:fill="auto"/>
             <w:vAlign w:val="center"/>
           </w:tcPr>
           <w:p>
@@ -10187,7 +9936,6 @@
                 <w:color w:val="303030"/>
                 <w:sz w:val="20"/>
                 <w:szCs w:val="20"/>
-                <w:highlight w:val="cyan"/>
                 <w:lang w:val="es-CO" w:eastAsia="es-CO"/>
               </w:rPr>
             </w:pPr>
@@ -10197,7 +9945,6 @@
                 <w:color w:val="303030"/>
                 <w:sz w:val="20"/>
                 <w:szCs w:val="20"/>
-                <w:highlight w:val="cyan"/>
                 <w:lang w:val="es-CO" w:eastAsia="es-CO"/>
               </w:rPr>
               <w:t>{var_16}</w:t>
@@ -10208,7 +9955,6 @@
           <w:tcPr>
             <w:tcW w:w="690" w:type="pct"/>
             <w:vMerge w:val="restart"/>
-            <w:shd w:val="clear" w:color="auto" w:fill="auto"/>
             <w:noWrap/>
             <w:vAlign w:val="center"/>
           </w:tcPr>
@@ -10220,7 +9966,6 @@
                 <w:color w:val="303030"/>
                 <w:sz w:val="20"/>
                 <w:szCs w:val="20"/>
-                <w:highlight w:val="cyan"/>
                 <w:lang w:val="es-CO" w:eastAsia="es-CO"/>
               </w:rPr>
             </w:pPr>
@@ -10230,7 +9975,6 @@
                 <w:color w:val="303030"/>
                 <w:sz w:val="20"/>
                 <w:szCs w:val="20"/>
-                <w:highlight w:val="cyan"/>
                 <w:lang w:val="es-CO" w:eastAsia="es-CO"/>
               </w:rPr>
               <w:t>{var_16}</w:t>
@@ -10241,7 +9985,6 @@
           <w:tcPr>
             <w:tcW w:w="595" w:type="pct"/>
             <w:vMerge w:val="restart"/>
-            <w:shd w:val="clear" w:color="auto" w:fill="auto"/>
             <w:vAlign w:val="center"/>
             <w:hideMark/>
           </w:tcPr>
@@ -10253,7 +9996,6 @@
                 <w:color w:val="303030"/>
                 <w:sz w:val="20"/>
                 <w:szCs w:val="20"/>
-                <w:highlight w:val="cyan"/>
                 <w:lang w:val="es-CO" w:eastAsia="es-CO"/>
               </w:rPr>
             </w:pPr>
@@ -10263,7 +10005,6 @@
                 <w:color w:val="303030"/>
                 <w:sz w:val="20"/>
                 <w:szCs w:val="20"/>
-                <w:highlight w:val="cyan"/>
                 <w:lang w:val="es-CO" w:eastAsia="es-CO"/>
               </w:rPr>
               <w:t>{var_17}</w:t>
@@ -10273,7 +10014,6 @@
         <w:tc>
           <w:tcPr>
             <w:tcW w:w="1044" w:type="pct"/>
-            <w:shd w:val="clear" w:color="auto" w:fill="auto"/>
             <w:vAlign w:val="center"/>
           </w:tcPr>
           <w:p>
@@ -10284,7 +10024,6 @@
                 <w:color w:val="303030"/>
                 <w:sz w:val="20"/>
                 <w:szCs w:val="20"/>
-                <w:highlight w:val="cyan"/>
                 <w:lang w:val="es-CO" w:eastAsia="es-CO"/>
               </w:rPr>
             </w:pPr>
@@ -10295,7 +10034,6 @@
                 <w:color w:val="303030"/>
                 <w:sz w:val="20"/>
                 <w:szCs w:val="20"/>
-                <w:highlight w:val="cyan"/>
               </w:rPr>
               <w:t>{var_13}</w:t>
             </w:r>
@@ -10305,7 +10043,6 @@
                 <w:color w:val="303030"/>
                 <w:sz w:val="20"/>
                 <w:szCs w:val="20"/>
-                <w:highlight w:val="cyan"/>
               </w:rPr>
             </w:r>
             <w:proofErr w:type="gramStart"/>
@@ -10315,7 +10052,6 @@
                 <w:color w:val="303030"/>
                 <w:sz w:val="20"/>
                 <w:szCs w:val="20"/>
-                <w:highlight w:val="cyan"/>
               </w:rPr>
             </w:r>
             <w:r>
@@ -10324,7 +10060,6 @@
                 <w:color w:val="303030"/>
                 <w:sz w:val="20"/>
                 <w:szCs w:val="20"/>
-                <w:highlight w:val="cyan"/>
               </w:rPr>
             </w:r>
             <w:r>
@@ -10333,7 +10068,6 @@
                 <w:color w:val="303030"/>
                 <w:sz w:val="20"/>
                 <w:szCs w:val="20"/>
-                <w:highlight w:val="cyan"/>
               </w:rPr>
             </w:r>
             <w:r>
@@ -10342,7 +10076,6 @@
                 <w:color w:val="303030"/>
                 <w:sz w:val="20"/>
                 <w:szCs w:val="20"/>
-                <w:highlight w:val="cyan"/>
               </w:rPr>
             </w:r>
             <w:r>
@@ -10351,7 +10084,6 @@
                 <w:color w:val="303030"/>
                 <w:sz w:val="20"/>
                 <w:szCs w:val="20"/>
-                <w:highlight w:val="cyan"/>
               </w:rPr>
             </w:r>
             <w:proofErr w:type="gramEnd"/>
@@ -10361,7 +10093,6 @@
                 <w:color w:val="303030"/>
                 <w:sz w:val="20"/>
                 <w:szCs w:val="20"/>
-                <w:highlight w:val="cyan"/>
               </w:rPr>
             </w:r>
             <w:proofErr w:type="spellEnd"/>
@@ -10370,7 +10101,6 @@
         <w:tc>
           <w:tcPr>
             <w:tcW w:w="988" w:type="pct"/>
-            <w:shd w:val="clear" w:color="auto" w:fill="auto"/>
             <w:vAlign w:val="center"/>
           </w:tcPr>
           <w:p>
@@ -10381,7 +10111,6 @@
                 <w:color w:val="303030"/>
                 <w:sz w:val="20"/>
                 <w:szCs w:val="20"/>
-                <w:highlight w:val="cyan"/>
                 <w:lang w:val="es-CO" w:eastAsia="es-CO"/>
               </w:rPr>
             </w:pPr>
@@ -10391,7 +10120,6 @@
                 <w:color w:val="303030"/>
                 <w:sz w:val="20"/>
                 <w:szCs w:val="20"/>
-                <w:highlight w:val="cyan"/>
                 <w:lang w:eastAsia="es-CO"/>
               </w:rPr>
               <w:t>{var_14}</w:t>
@@ -10402,7 +10130,6 @@
                 <w:color w:val="303030"/>
                 <w:sz w:val="20"/>
                 <w:szCs w:val="20"/>
-                <w:highlight w:val="cyan"/>
                 <w:lang w:eastAsia="es-CO"/>
               </w:rPr>
             </w:r>
@@ -10412,7 +10139,6 @@
                 <w:color w:val="303030"/>
                 <w:sz w:val="20"/>
                 <w:szCs w:val="20"/>
-                <w:highlight w:val="cyan"/>
                 <w:lang w:eastAsia="es-CO"/>
               </w:rPr>
             </w:r>
@@ -10437,7 +10163,6 @@
                 <w:color w:val="303030"/>
                 <w:sz w:val="20"/>
                 <w:szCs w:val="20"/>
-                <w:highlight w:val="cyan"/>
                 <w:lang w:val="es-CO" w:eastAsia="es-CO"/>
               </w:rPr>
             </w:pPr>
@@ -10456,7 +10181,6 @@
                 <w:color w:val="303030"/>
                 <w:sz w:val="20"/>
                 <w:szCs w:val="20"/>
-                <w:highlight w:val="cyan"/>
                 <w:lang w:val="es-CO" w:eastAsia="es-CO"/>
               </w:rPr>
             </w:pPr>
@@ -10475,7 +10199,6 @@
                 <w:color w:val="303030"/>
                 <w:sz w:val="20"/>
                 <w:szCs w:val="20"/>
-                <w:highlight w:val="cyan"/>
                 <w:lang w:val="es-CO" w:eastAsia="es-CO"/>
               </w:rPr>
             </w:pPr>
@@ -10495,7 +10218,6 @@
                 <w:color w:val="303030"/>
                 <w:sz w:val="20"/>
                 <w:szCs w:val="20"/>
-                <w:highlight w:val="cyan"/>
                 <w:lang w:val="es-CO" w:eastAsia="es-CO"/>
               </w:rPr>
             </w:pPr>
@@ -10504,7 +10226,6 @@
         <w:tc>
           <w:tcPr>
             <w:tcW w:w="1044" w:type="pct"/>
-            <w:shd w:val="clear" w:color="auto" w:fill="auto"/>
             <w:vAlign w:val="center"/>
           </w:tcPr>
           <w:p>
@@ -10515,7 +10236,6 @@
                 <w:color w:val="303030"/>
                 <w:sz w:val="20"/>
                 <w:szCs w:val="20"/>
-                <w:highlight w:val="cyan"/>
                 <w:lang w:val="es-CO" w:eastAsia="es-CO"/>
               </w:rPr>
             </w:pPr>
@@ -10526,7 +10246,6 @@
                 <w:color w:val="303030"/>
                 <w:sz w:val="20"/>
                 <w:szCs w:val="20"/>
-                <w:highlight w:val="cyan"/>
               </w:rPr>
               <w:t>{var_18}</w:t>
             </w:r>
@@ -10537,7 +10256,6 @@
                 <w:color w:val="303030"/>
                 <w:sz w:val="20"/>
                 <w:szCs w:val="20"/>
-                <w:highlight w:val="cyan"/>
               </w:rPr>
             </w:r>
             <w:proofErr w:type="gramEnd"/>
@@ -10547,7 +10265,6 @@
                 <w:color w:val="303030"/>
                 <w:sz w:val="20"/>
                 <w:szCs w:val="20"/>
-                <w:highlight w:val="cyan"/>
               </w:rPr>
             </w:r>
             <w:r>
@@ -10556,7 +10273,6 @@
                 <w:color w:val="303030"/>
                 <w:sz w:val="20"/>
                 <w:szCs w:val="20"/>
-                <w:highlight w:val="cyan"/>
               </w:rPr>
             </w:r>
             <w:proofErr w:type="spellEnd"/>
@@ -10565,7 +10281,6 @@
         <w:tc>
           <w:tcPr>
             <w:tcW w:w="988" w:type="pct"/>
-            <w:shd w:val="clear" w:color="auto" w:fill="auto"/>
             <w:vAlign w:val="center"/>
           </w:tcPr>
           <w:p>
@@ -10576,7 +10291,6 @@
                 <w:color w:val="303030"/>
                 <w:sz w:val="20"/>
                 <w:szCs w:val="20"/>
-                <w:highlight w:val="cyan"/>
                 <w:lang w:val="es-CO" w:eastAsia="es-CO"/>
               </w:rPr>
             </w:pPr>
@@ -10586,7 +10300,6 @@
                 <w:color w:val="303030"/>
                 <w:sz w:val="20"/>
                 <w:szCs w:val="20"/>
-                <w:highlight w:val="cyan"/>
                 <w:lang w:eastAsia="es-CO"/>
               </w:rPr>
               <w:t>{var_19}</w:t>
@@ -10597,7 +10310,6 @@
                 <w:color w:val="303030"/>
                 <w:sz w:val="20"/>
                 <w:szCs w:val="20"/>
-                <w:highlight w:val="cyan"/>
                 <w:lang w:eastAsia="es-CO"/>
               </w:rPr>
             </w:r>
@@ -10624,7 +10336,7 @@
           <w:color w:val="303030"/>
           <w:lang w:val="es-CO"/>
         </w:rPr>
-        <w:t xml:space="preserve">Fuente: SERAMBIENTE S.A.S., </w:t>
+        <w:t>Fuente: SERAMBIENTE S.A.S., </w:t>
       </w:r>
       <w:commentRangeStart w:id="108"/>
       <w:r>
@@ -10680,7 +10392,6 @@
         <w:rPr>
           <w:rFonts w:ascii="Avenir Next LT Pro" w:hAnsi="Avenir Next LT Pro" w:cs="Calibri"/>
           <w:color w:val="303030"/>
-          <w:highlight w:val="cyan"/>
           <w:lang w:val="es-CO"/>
         </w:rPr>
       </w:pPr>
@@ -10689,7 +10400,6 @@
           <w:rFonts w:ascii="Avenir Next LT Pro" w:hAnsi="Avenir Next LT Pro"/>
           <w:noProof/>
           <w:color w:val="303030"/>
-          <w:highlight w:val="cyan"/>
         </w:rPr>
         <w:t>{var_5}</w:t>
       </w:r>
@@ -10716,7 +10426,7 @@
           <w:color w:val="303030"/>
           <w:lang w:val="es-CO"/>
         </w:rPr>
-        <w:t xml:space="preserve">Figura </w:t>
+        <w:t>Figura </w:t>
       </w:r>
       <w:r>
         <w:rPr>
@@ -10766,7 +10476,7 @@
           <w:color w:val="303030"/>
           <w:lang w:val="es-CO"/>
         </w:rPr>
-        <w:t xml:space="preserve">. </w:t>
+        <w:t>. </w:t>
       </w:r>
       <w:r>
         <w:rPr>
@@ -10782,13 +10492,12 @@
           <w:color w:val="303030"/>
           <w:lang w:val="es-CO"/>
         </w:rPr>
-        <w:t xml:space="preserve"> geográfica </w:t>
+        <w:t> geográfica </w:t>
       </w:r>
       <w:r>
         <w:rPr>
           <w:rFonts w:ascii="Avenir Next LT Pro" w:hAnsi="Avenir Next LT Pro" w:cs="Calibri"/>
           <w:color w:val="303030"/>
-          <w:highlight w:val="cyan"/>
           <w:lang w:val="es-CO"/>
         </w:rPr>
         <w:t>{1_ubicacion_geografica_1}</w:t>
@@ -10797,7 +10506,6 @@
         <w:rPr>
           <w:rFonts w:ascii="Avenir Next LT Pro" w:hAnsi="Avenir Next LT Pro" w:cs="Calibri"/>
           <w:color w:val="303030"/>
-          <w:highlight w:val="cyan"/>
           <w:lang w:val="es-CO"/>
         </w:rPr>
       </w:r>
@@ -10805,7 +10513,6 @@
         <w:rPr>
           <w:rFonts w:ascii="Avenir Next LT Pro" w:hAnsi="Avenir Next LT Pro" w:cs="Calibri"/>
           <w:color w:val="303030"/>
-          <w:highlight w:val="cyan"/>
           <w:lang w:val="es-CO"/>
         </w:rPr>
       </w:r>
@@ -10815,7 +10522,7 @@
           <w:color w:val="303030"/>
           <w:lang w:val="es-CO"/>
         </w:rPr>
-        <w:t xml:space="preserve"> de monitoreo</w:t>
+        <w:t> de monitoreo</w:t>
       </w:r>
       <w:bookmarkEnd w:id="110"/>
       <w:bookmarkEnd w:id="111"/>
@@ -10844,7 +10551,7 @@
           <w:szCs w:val="20"/>
           <w:lang w:val="es-CO"/>
         </w:rPr>
-        <w:t xml:space="preserve">Fuente: </w:t>
+        <w:t>Fuente: </w:t>
       </w:r>
       <w:r>
         <w:rPr>
@@ -10855,7 +10562,7 @@
           <w:szCs w:val="20"/>
           <w:lang w:val="es-CO"/>
         </w:rPr>
-        <w:t xml:space="preserve">Tomado y modificado de </w:t>
+        <w:t>Tomado y modificado de </w:t>
       </w:r>
       <w:r>
         <w:rPr>
@@ -10866,7 +10573,7 @@
           <w:szCs w:val="20"/>
           <w:lang w:val="es-CO"/>
         </w:rPr>
-        <w:t xml:space="preserve">Google </w:t>
+        <w:t>Google </w:t>
       </w:r>
       <w:proofErr w:type="spellStart"/>
       <w:r>
@@ -10890,7 +10597,7 @@
           <w:szCs w:val="20"/>
           <w:lang w:val="es-CO"/>
         </w:rPr>
-        <w:t xml:space="preserve">., </w:t>
+        <w:t>., </w:t>
       </w:r>
       <w:commentRangeStart w:id="114"/>
       <w:r>
@@ -10984,7 +10691,6 @@
           <w:color w:val="303030"/>
           <w:sz w:val="22"/>
           <w:szCs w:val="22"/>
-          <w:highlight w:val="cyan"/>
           <w:lang w:val="es-CO"/>
         </w:rPr>
         <w:t>{en_cumplimiento_de_los_compromisos_establecidos_co_1}</w:t>
@@ -10996,7 +10702,6 @@
           <w:color w:val="303030"/>
           <w:sz w:val="22"/>
           <w:szCs w:val="22"/>
-          <w:highlight w:val="cyan"/>
           <w:lang w:val="es-CO"/>
         </w:rPr>
       </w:r>
@@ -11009,7 +10714,7 @@
           <w:szCs w:val="22"/>
           <w:lang w:val="es-CO"/>
         </w:rPr>
-        <w:t xml:space="preserve"> </w:t>
+        <w:t> </w:t>
       </w:r>
       <w:r>
         <w:rPr>
@@ -11018,7 +10723,7 @@
           <w:sz w:val="22"/>
           <w:szCs w:val="22"/>
         </w:rPr>
-        <w:t xml:space="preserve">en </w:t>
+        <w:t>en </w:t>
       </w:r>
       <w:r>
         <w:rPr>
@@ -11036,7 +10741,7 @@
           <w:sz w:val="22"/>
           <w:szCs w:val="22"/>
         </w:rPr>
-        <w:t xml:space="preserve"> los compromisos establecidos con la autoridad </w:t>
+        <w:t> los compromisos establecidos con la autoridad </w:t>
       </w:r>
       <w:r>
         <w:rPr>
@@ -11045,7 +10750,7 @@
           <w:sz w:val="22"/>
           <w:szCs w:val="22"/>
         </w:rPr>
-        <w:t xml:space="preserve">ambiental, programó la realización de </w:t>
+        <w:t>ambiental, programó la realización de </w:t>
       </w:r>
       <w:r>
         <w:rPr>
@@ -11074,7 +10779,7 @@
           <w:sz w:val="22"/>
           <w:szCs w:val="22"/>
         </w:rPr>
-        <w:t xml:space="preserve">) puntos ubicados en ciudad/departamento; </w:t>
+        <w:t>) puntos ubicados en {tag_ciudad_dept_concl}; </w:t>
       </w:r>
       <w:r>
         <w:rPr>
@@ -11083,7 +10788,7 @@
           <w:sz w:val="22"/>
           <w:szCs w:val="22"/>
         </w:rPr>
-        <w:t xml:space="preserve">No obstante, esta actividad no pudo ejecutarse debido a que los puntos se encontraban secos, lo que impidió la toma de muestras </w:t>
+        <w:t>No obstante, esta actividad no pudo ejecutarse debido a que los puntos se encontraban secos, lo que impidió la toma de muestras </w:t>
       </w:r>
       <w:r>
         <w:rPr>
@@ -11255,7 +10960,7 @@
           <w:color w:val="303030"/>
           <w:lang w:val="es-CO"/>
         </w:rPr>
-        <w:t xml:space="preserve"> </w:t>
+        <w:t> </w:t>
       </w:r>
     </w:p>
     <w:p>
@@ -11283,15 +10988,7 @@
           <w:color w:val="303030"/>
           <w:lang w:val="es-CO"/>
         </w:rPr>
-        <w:t xml:space="preserve">, </w:t>
-      </w:r>
-      <w:r>
-        <w:rPr>
-          <w:rFonts w:ascii="Avenir Next LT Pro" w:hAnsi="Avenir Next LT Pro"/>
-          <w:color w:val="303030"/>
-          <w:lang w:val="es-CO"/>
-        </w:rPr>
-        <w:t xml:space="preserve">Colombia </w:t>
+        <w:t>, Colombia </w:t>
       </w:r>
     </w:p>
     <w:p>
@@ -11406,7 +11103,7 @@
           <w:szCs w:val="16"/>
           <w:lang w:val="es-CO"/>
         </w:rPr>
-        <w:t xml:space="preserve">INFORME VÁLIDO ÚNICAMENTE PARA LA(S) MUESTRA(S) ANALIZADA(S). LA REPRODUCCIÓN PARCIAL O TOTAL DEL PRESENTE INFORME DEBE HACERSE CON AUTORIZACIÓN EXPRESA DE SERAMBIENTE S.A.S. CUALQUIER TIPO DE OBSERVACIÓN REQUERIDA POR EL CLIENTE Y RELACIONADA CON LOS RESULTADOS EMITIDOS, SÓLO SERÁ ACEPTADA DENTRO DE LOS </w:t>
+        <w:t>INFORME VÁLIDO ÚNICAMENTE PARA LA(S) MUESTRA(S) ANALIZADA(S). LA REPRODUCCIÓN PARCIAL O TOTAL DEL PRESENTE INFORME DEBE HACERSE CON AUTORIZACIÓN EXPRESA DE SERAMBIENTE S.A.S. CUALQUIER TIPO DE OBSERVACIÓN REQUERIDA POR EL CLIENTE Y RELACIONADA CON LOS RESULTADOS EMITIDOS, SÓLO SERÁ ACEPTADA DENTRO DE LOS </w:t>
       </w:r>
       <w:r>
         <w:rPr>
@@ -11446,7 +11143,7 @@
           <w:szCs w:val="16"/>
           <w:lang w:val="es-CO"/>
         </w:rPr>
-        <w:t xml:space="preserve"> DÍAS</w:t>
+        <w:t> DÍAS</w:t>
       </w:r>
       <w:r>
         <w:rPr>
@@ -11456,7 +11153,7 @@
           <w:szCs w:val="16"/>
           <w:lang w:val="es-CO"/>
         </w:rPr>
-        <w:t xml:space="preserve"> HÁBILES</w:t>
+        <w:t> HÁBILES</w:t>
       </w:r>
       <w:r>
         <w:rPr>
@@ -11466,7 +11163,7 @@
           <w:szCs w:val="16"/>
           <w:lang w:val="es-CO"/>
         </w:rPr>
-        <w:t xml:space="preserve"> SIGUIENTES AL ENVÍO DE ESTE INFORME. SI NO SE RECIBE OBSERVACIÓN EN EL TIEMPO ESTABLECIDO, SE DA POR ACEPTADO EL INFORME Y SE PROCEDERÁ </w:t>
+        <w:t> SIGUIENTES AL ENVÍO DE ESTE INFORME. SI NO SE RECIBE OBSERVACIÓN EN EL TIEMPO ESTABLECIDO, SE DA POR ACEPTADO EL INFORME Y SE PROCEDERÁ </w:t>
       </w:r>
       <w:r>
         <w:rPr>
@@ -11496,7 +11193,7 @@
           <w:szCs w:val="16"/>
           <w:lang w:val="es-CO"/>
         </w:rPr>
-        <w:t xml:space="preserve"> RESERVA DE MUESTRAS: EL LABORATORIO ESTABLECE UN PERIODO DE 20 D</w:t>
+        <w:t> RESERVA DE MUESTRAS: EL LABORATORIO ESTABLECE UN PERIODO DE 20 D</w:t>
       </w:r>
       <w:r>
         <w:rPr>
@@ -11553,7 +11250,7 @@
           <w:szCs w:val="16"/>
           <w:lang w:val="es-CO"/>
         </w:rPr>
-        <w:t xml:space="preserve"> DISPOSICI</w:t>
+        <w:t> DISPOSICI</w:t>
       </w:r>
       <w:proofErr w:type="spellStart"/>
       <w:r>
@@ -11780,7 +11477,7 @@
           <w:szCs w:val="22"/>
           <w:lang w:val="en-US"/>
         </w:rPr>
-        <w:t xml:space="preserve">American Public </w:t>
+        <w:t>American Public </w:t>
       </w:r>
       <w:proofErr w:type="spellStart"/>
       <w:r>
@@ -11802,7 +11499,7 @@
           <w:szCs w:val="22"/>
           <w:lang w:val="en-US"/>
         </w:rPr>
-        <w:t xml:space="preserve"> Association (APHA). </w:t>
+        <w:t> Association (APHA). </w:t>
       </w:r>
       <w:r>
         <w:rPr>
@@ -11810,7 +11507,6 @@
           <w:color w:val="303030"/>
           <w:sz w:val="22"/>
           <w:szCs w:val="22"/>
-          <w:highlight w:val="cyan"/>
           <w:lang w:val="en-US"/>
         </w:rPr>
         <w:t>{american_public_healt_association_apha_1}</w:t>
@@ -11821,7 +11517,6 @@
           <w:color w:val="303030"/>
           <w:sz w:val="22"/>
           <w:szCs w:val="22"/>
-          <w:highlight w:val="cyan"/>
           <w:lang w:val="en-US"/>
         </w:rPr>
       </w:r>
@@ -11831,7 +11526,6 @@
           <w:color w:val="303030"/>
           <w:sz w:val="22"/>
           <w:szCs w:val="22"/>
-          <w:highlight w:val="cyan"/>
           <w:lang w:val="en-US"/>
         </w:rPr>
       </w:r>
@@ -11841,7 +11535,6 @@
           <w:color w:val="303030"/>
           <w:sz w:val="22"/>
           <w:szCs w:val="22"/>
-          <w:highlight w:val="cyan"/>
           <w:lang w:val="en-US"/>
         </w:rPr>
       </w:r>
@@ -11853,7 +11546,7 @@
           <w:szCs w:val="22"/>
           <w:lang w:val="en-US"/>
         </w:rPr>
-        <w:t xml:space="preserve">. Standard Methods for the Examination of Water and Wastewater. </w:t>
+        <w:t>. Standard Methods for the Examination of Water and Wastewater. </w:t>
       </w:r>
       <w:r>
         <w:rPr>
@@ -11861,7 +11554,6 @@
           <w:color w:val="303030"/>
           <w:sz w:val="22"/>
           <w:szCs w:val="22"/>
-          <w:highlight w:val="cyan"/>
           <w:lang w:val="en-US"/>
         </w:rPr>
         <w:t>{standard_methods_for_the_examination_of_water_and__1}</w:t>
@@ -11872,7 +11564,6 @@
           <w:color w:val="303030"/>
           <w:sz w:val="22"/>
           <w:szCs w:val="22"/>
-          <w:highlight w:val="cyan"/>
           <w:lang w:val="en-US"/>
         </w:rPr>
       </w:r>
@@ -11882,7 +11573,6 @@
           <w:color w:val="303030"/>
           <w:sz w:val="22"/>
           <w:szCs w:val="22"/>
-          <w:highlight w:val="cyan"/>
           <w:lang w:val="en-US"/>
         </w:rPr>
       </w:r>
@@ -11894,7 +11584,7 @@
           <w:szCs w:val="22"/>
           <w:lang w:val="en-US"/>
         </w:rPr>
-        <w:t xml:space="preserve">. Amer. Pub. </w:t>
+        <w:t>. Amer. Pub. </w:t>
       </w:r>
       <w:proofErr w:type="spellStart"/>
       <w:r>
@@ -11916,7 +11606,7 @@
           <w:szCs w:val="22"/>
           <w:lang w:val="es-CO"/>
         </w:rPr>
-        <w:t xml:space="preserve">. </w:t>
+        <w:t>. </w:t>
       </w:r>
       <w:proofErr w:type="spellStart"/>
       <w:r>
@@ -11938,7 +11628,7 @@
           <w:szCs w:val="22"/>
           <w:lang w:val="es-CO"/>
         </w:rPr>
-        <w:t xml:space="preserve">., Washington. </w:t>
+        <w:t>., Washington. </w:t>
       </w:r>
       <w:proofErr w:type="gramStart"/>
       <w:r>
@@ -11978,7 +11668,6 @@
           <w:color w:val="303030"/>
           <w:sz w:val="22"/>
           <w:szCs w:val="22"/>
-          <w:highlight w:val="cyan"/>
           <w:lang w:val="es-ES"/>
         </w:rPr>
       </w:pPr>
@@ -11990,7 +11679,6 @@
           <w:color w:val="303030"/>
           <w:sz w:val="22"/>
           <w:szCs w:val="22"/>
-          <w:highlight w:val="cyan"/>
         </w:rPr>
         <w:t>{obtenido_de_1}</w:t>
       </w:r>
@@ -12010,7 +11698,6 @@
           <w:color w:val="303030"/>
           <w:sz w:val="22"/>
           <w:szCs w:val="22"/>
-          <w:highlight w:val="cyan"/>
         </w:rPr>
         <w:t>{obtenido_de_www_es_climate_data_org_1}</w:t>
       </w:r>
@@ -12021,7 +11708,6 @@
           <w:color w:val="303030"/>
           <w:sz w:val="22"/>
           <w:szCs w:val="22"/>
-          <w:highlight w:val="cyan"/>
         </w:rPr>
       </w:r>
       <w:r>
@@ -12031,16 +11717,7 @@
           <w:sz w:val="22"/>
           <w:szCs w:val="22"/>
         </w:rPr>
-        <w:t>. Obtenido de:</w:t>
-      </w:r>
-      <w:r>
-        <w:rPr>
-          <w:rFonts w:ascii="Avenir Next LT Pro" w:hAnsi="Avenir Next LT Pro" w:cstheme="minorHAnsi"/>
-          <w:color w:val="303030"/>
-          <w:sz w:val="22"/>
-          <w:szCs w:val="22"/>
-        </w:rPr>
-        <w:t xml:space="preserve"> </w:t>
+        <w:t>. Obtenido de: </w:t>
       </w:r>
       <w:r>
         <w:rPr>
@@ -12087,7 +11764,7 @@
           <w:szCs w:val="22"/>
           <w:lang w:val="es-CO"/>
         </w:rPr>
-        <w:t xml:space="preserve"> </w:t>
+        <w:t> </w:t>
       </w:r>
       <w:r>
         <w:rPr>
@@ -12264,7 +11941,7 @@
           <w:szCs w:val="22"/>
           <w:lang w:val="es-CO"/>
         </w:rPr>
-        <w:t xml:space="preserve"> </w:t>
+        <w:t> </w:t>
       </w:r>
       <w:r>
         <w:rPr>
@@ -12315,7 +11992,7 @@
           <w:szCs w:val="22"/>
           <w:lang w:val="es-419"/>
         </w:rPr>
-        <w:t xml:space="preserve">Tabla </w:t>
+        <w:t>Tabla </w:t>
       </w:r>
       <w:r>
         <w:rPr>
@@ -12348,7 +12025,7 @@
           <w:szCs w:val="22"/>
           <w:lang w:val="es-CO"/>
         </w:rPr>
-        <w:t xml:space="preserve"> </w:t>
+        <w:t> </w:t>
       </w:r>
       <w:r>
         <w:rPr>
@@ -12390,7 +12067,7 @@
           <w:szCs w:val="20"/>
           <w:lang w:val="es-419"/>
         </w:rPr>
-        <w:t xml:space="preserve">Tabla </w:t>
+        <w:t>Tabla </w:t>
       </w:r>
       <w:r>
         <w:rPr>
@@ -12500,7 +12177,6 @@
         <w:tc>
           <w:tcPr>
             <w:tcW w:w="1682" w:type="pct"/>
-            <w:shd w:val="clear" w:color="000000" w:fill="004CAB"/>
             <w:vAlign w:val="center"/>
             <w:hideMark/>
           </w:tcPr>
@@ -12546,7 +12222,6 @@
         <w:tc>
           <w:tcPr>
             <w:tcW w:w="1126" w:type="pct"/>
-            <w:shd w:val="clear" w:color="000000" w:fill="004CAB"/>
             <w:vAlign w:val="center"/>
             <w:hideMark/>
           </w:tcPr>
@@ -12591,7 +12266,6 @@
         <w:tc>
           <w:tcPr>
             <w:tcW w:w="1125" w:type="pct"/>
-            <w:shd w:val="clear" w:color="000000" w:fill="004CAB"/>
             <w:vAlign w:val="center"/>
             <w:hideMark/>
           </w:tcPr>
@@ -12636,7 +12310,6 @@
         <w:tc>
           <w:tcPr>
             <w:tcW w:w="1067" w:type="pct"/>
-            <w:shd w:val="clear" w:color="000000" w:fill="004CAB"/>
             <w:vAlign w:val="center"/>
             <w:hideMark/>
           </w:tcPr>
@@ -12687,7 +12360,6 @@
         <w:tc>
           <w:tcPr>
             <w:tcW w:w="1682" w:type="pct"/>
-            <w:shd w:val="clear" w:color="auto" w:fill="auto"/>
             <w:vAlign w:val="center"/>
             <w:hideMark/>
           </w:tcPr>
@@ -12712,7 +12384,7 @@
                 <w:szCs w:val="20"/>
                 <w:lang w:val="es-ES" w:eastAsia="es-CO"/>
               </w:rPr>
-              <w:t xml:space="preserve">Anexo 1. </w:t>
+              <w:t>Anexo 1. </w:t>
             </w:r>
             <w:r>
               <w:rPr>
@@ -12739,7 +12411,6 @@
         <w:tc>
           <w:tcPr>
             <w:tcW w:w="1126" w:type="pct"/>
-            <w:shd w:val="clear" w:color="auto" w:fill="auto"/>
             <w:vAlign w:val="center"/>
             <w:hideMark/>
           </w:tcPr>
@@ -12759,7 +12430,6 @@
         <w:tc>
           <w:tcPr>
             <w:tcW w:w="1125" w:type="pct"/>
-            <w:shd w:val="clear" w:color="auto" w:fill="auto"/>
             <w:vAlign w:val="center"/>
             <w:hideMark/>
           </w:tcPr>
@@ -12779,7 +12449,6 @@
         <w:tc>
           <w:tcPr>
             <w:tcW w:w="1067" w:type="pct"/>
-            <w:shd w:val="clear" w:color="auto" w:fill="auto"/>
             <w:vAlign w:val="center"/>
             <w:hideMark/>
           </w:tcPr>
@@ -12805,7 +12474,6 @@
         <w:tc>
           <w:tcPr>
             <w:tcW w:w="1682" w:type="pct"/>
-            <w:shd w:val="clear" w:color="auto" w:fill="auto"/>
             <w:vAlign w:val="center"/>
           </w:tcPr>
           <w:p>
@@ -12831,7 +12499,7 @@
                 <w:szCs w:val="20"/>
                 <w:lang w:val="es-ES" w:eastAsia="es-CO"/>
               </w:rPr>
-              <w:t xml:space="preserve">Anexo 2. </w:t>
+              <w:t>Anexo 2. </w:t>
             </w:r>
             <w:r>
               <w:rPr>
@@ -12848,7 +12516,6 @@
         <w:tc>
           <w:tcPr>
             <w:tcW w:w="1126" w:type="pct"/>
-            <w:shd w:val="clear" w:color="auto" w:fill="auto"/>
             <w:vAlign w:val="center"/>
           </w:tcPr>
           <w:p>
@@ -12867,7 +12534,6 @@
         <w:tc>
           <w:tcPr>
             <w:tcW w:w="1125" w:type="pct"/>
-            <w:shd w:val="clear" w:color="auto" w:fill="auto"/>
             <w:vAlign w:val="center"/>
           </w:tcPr>
           <w:p>
@@ -12886,7 +12552,6 @@
         <w:tc>
           <w:tcPr>
             <w:tcW w:w="1067" w:type="pct"/>
-            <w:shd w:val="clear" w:color="auto" w:fill="auto"/>
             <w:vAlign w:val="center"/>
           </w:tcPr>
           <w:p>
@@ -12911,7 +12576,6 @@
         <w:tc>
           <w:tcPr>
             <w:tcW w:w="1682" w:type="pct"/>
-            <w:shd w:val="clear" w:color="auto" w:fill="auto"/>
             <w:vAlign w:val="center"/>
             <w:hideMark/>
           </w:tcPr>
@@ -12946,14 +12610,13 @@
                 <w:szCs w:val="20"/>
                 <w:lang w:val="es-ES" w:eastAsia="es-CO"/>
               </w:rPr>
-              <w:t xml:space="preserve"> Resolución de acreditación del IDEAM</w:t>
+              <w:t> Resolución de acreditación del IDEAM</w:t>
             </w:r>
           </w:p>
         </w:tc>
         <w:tc>
           <w:tcPr>
             <w:tcW w:w="1126" w:type="pct"/>
-            <w:shd w:val="clear" w:color="auto" w:fill="auto"/>
             <w:vAlign w:val="center"/>
             <w:hideMark/>
           </w:tcPr>
@@ -12973,7 +12636,6 @@
         <w:tc>
           <w:tcPr>
             <w:tcW w:w="1125" w:type="pct"/>
-            <w:shd w:val="clear" w:color="auto" w:fill="auto"/>
             <w:vAlign w:val="center"/>
             <w:hideMark/>
           </w:tcPr>
@@ -12993,7 +12655,6 @@
         <w:tc>
           <w:tcPr>
             <w:tcW w:w="1067" w:type="pct"/>
-            <w:shd w:val="clear" w:color="auto" w:fill="auto"/>
             <w:vAlign w:val="center"/>
             <w:hideMark/>
           </w:tcPr>
@@ -13034,7 +12695,7 @@
           <w:szCs w:val="20"/>
           <w:lang w:val="es-CO"/>
         </w:rPr>
-        <w:t xml:space="preserve">Fuente: SERAMBIENTE S.A.S., </w:t>
+        <w:t>Fuente: SERAMBIENTE S.A.S., </w:t>
       </w:r>
       <w:commentRangeStart w:id="133"/>
       <w:r>
@@ -13078,7 +12739,7 @@
           <w:szCs w:val="20"/>
           <w:lang w:val="es-CO"/>
         </w:rPr>
-        <w:t xml:space="preserve"> </w:t>
+        <w:t> </w:t>
       </w:r>
     </w:p>
     <w:p>
@@ -13091,7 +12752,6 @@
           <w:color w:val="303030"/>
           <w:sz w:val="20"/>
           <w:szCs w:val="20"/>
-          <w:highlight w:val="yellow"/>
           <w:lang w:val="es-CO"/>
         </w:rPr>
       </w:pPr>
@@ -13102,7 +12762,6 @@
           <w:color w:val="303030"/>
           <w:sz w:val="20"/>
           <w:szCs w:val="20"/>
-          <w:highlight w:val="yellow"/>
           <w:lang w:val="es-CO"/>
         </w:rPr>
         <w:br w:type="page"/>
@@ -13122,7 +12781,7 @@
         <w:t>ORIAL</w:t>
       </w:r>
       <w:r>
-        <w:t xml:space="preserve"> DE CAMBIOS</w:t>
+        <w:t> DE CAMBIOS</w:t>
       </w:r>
       <w:bookmarkEnd w:id="134"/>
       <w:bookmarkEnd w:id="135"/>
@@ -13137,7 +12796,6 @@
           <w:color w:val="303030"/>
           <w:sz w:val="20"/>
           <w:szCs w:val="20"/>
-          <w:highlight w:val="yellow"/>
           <w:lang w:val="es-CO"/>
         </w:rPr>
       </w:pPr>
@@ -13164,7 +12822,7 @@
           <w:color w:val="303030"/>
           <w:lang w:val="es-419"/>
         </w:rPr>
-        <w:t xml:space="preserve">Tabla </w:t>
+        <w:t>Tabla </w:t>
       </w:r>
       <w:r>
         <w:rPr>
@@ -13210,7 +12868,7 @@
           <w:color w:val="303030"/>
           <w:lang w:val="es-419"/>
         </w:rPr>
-        <w:t xml:space="preserve">. </w:t>
+        <w:t>. </w:t>
       </w:r>
       <w:r>
         <w:rPr>
@@ -13231,7 +12889,7 @@
           <w:rFonts w:ascii="Avenir Next LT Pro" w:hAnsi="Avenir Next LT Pro" w:cs="Calibri"/>
           <w:color w:val="303030"/>
         </w:rPr>
-        <w:t xml:space="preserve"> de cambios.</w:t>
+        <w:t> de cambios.</w:t>
       </w:r>
       <w:bookmarkStart w:id="140" w:name="_Hlk197067180"/>
       <w:bookmarkEnd w:id="136"/>
@@ -13271,7 +12929,6 @@
         <w:tc>
           <w:tcPr>
             <w:tcW w:w="522" w:type="pct"/>
-            <w:shd w:val="clear" w:color="000000" w:fill="004CAB"/>
             <w:vAlign w:val="center"/>
             <w:hideMark/>
           </w:tcPr>
@@ -13306,7 +12963,6 @@
         <w:tc>
           <w:tcPr>
             <w:tcW w:w="1253" w:type="pct"/>
-            <w:shd w:val="clear" w:color="000000" w:fill="004CAB"/>
             <w:vAlign w:val="center"/>
             <w:hideMark/>
           </w:tcPr>
@@ -13340,7 +12996,6 @@
         <w:tc>
           <w:tcPr>
             <w:tcW w:w="853" w:type="pct"/>
-            <w:shd w:val="clear" w:color="000000" w:fill="004CAB"/>
             <w:vAlign w:val="center"/>
             <w:hideMark/>
           </w:tcPr>
@@ -13400,7 +13055,6 @@
         <w:tc>
           <w:tcPr>
             <w:tcW w:w="928" w:type="pct"/>
-            <w:shd w:val="clear" w:color="000000" w:fill="004CAB"/>
             <w:vAlign w:val="center"/>
             <w:hideMark/>
           </w:tcPr>
@@ -13471,7 +13125,6 @@
         <w:tc>
           <w:tcPr>
             <w:tcW w:w="722" w:type="pct"/>
-            <w:shd w:val="clear" w:color="000000" w:fill="004CAB"/>
             <w:vAlign w:val="center"/>
             <w:hideMark/>
           </w:tcPr>
@@ -13505,7 +13158,6 @@
         <w:tc>
           <w:tcPr>
             <w:tcW w:w="722" w:type="pct"/>
-            <w:shd w:val="clear" w:color="000000" w:fill="004CAB"/>
             <w:vAlign w:val="center"/>
             <w:hideMark/>
           </w:tcPr>
@@ -13545,7 +13197,6 @@
           <w:tcPr>
             <w:tcW w:w="522" w:type="pct"/>
             <w:vMerge w:val="restart"/>
-            <w:shd w:val="clear" w:color="auto" w:fill="auto"/>
             <w:vAlign w:val="center"/>
             <w:hideMark/>
           </w:tcPr>
@@ -13568,17 +13219,7 @@
                 <w:szCs w:val="20"/>
                 <w:lang w:val="es-CO" w:eastAsia="es-CO"/>
               </w:rPr>
-              <w:t>0</w:t>
-            </w:r>
-            <w:r>
-              <w:rPr>
-                <w:rFonts w:ascii="Avenir Next LT Pro" w:eastAsia="Times New Roman" w:hAnsi="Avenir Next LT Pro" w:cs="Times New Roman"/>
-                <w:color w:val="484848"/>
-                <w:sz w:val="20"/>
-                <w:szCs w:val="20"/>
-                <w:lang w:val="es-CO" w:eastAsia="es-CO"/>
-              </w:rPr>
-              <w:t>0</w:t>
+              <w:t>00</w:t>
             </w:r>
           </w:p>
         </w:tc>
@@ -13586,7 +13227,6 @@
           <w:tcPr>
             <w:tcW w:w="1253" w:type="pct"/>
             <w:vMerge w:val="restart"/>
-            <w:shd w:val="clear" w:color="auto" w:fill="auto"/>
             <w:vAlign w:val="center"/>
             <w:hideMark/>
           </w:tcPr>
@@ -13609,7 +13249,7 @@
                 <w:szCs w:val="20"/>
                 <w:lang w:val="en-US"/>
               </w:rPr>
-              <w:t>OTXXXX-X-A-XXXX-V00</w:t>
+              <w:t>{tag_ot_code_v00}</w:t>
             </w:r>
           </w:p>
         </w:tc>
@@ -13617,7 +13257,6 @@
           <w:tcPr>
             <w:tcW w:w="853" w:type="pct"/>
             <w:vMerge w:val="restart"/>
-            <w:shd w:val="clear" w:color="auto" w:fill="auto"/>
             <w:vAlign w:val="center"/>
             <w:hideMark/>
           </w:tcPr>
@@ -13647,7 +13286,6 @@
         <w:tc>
           <w:tcPr>
             <w:tcW w:w="928" w:type="pct"/>
-            <w:shd w:val="clear" w:color="auto" w:fill="auto"/>
             <w:vAlign w:val="center"/>
             <w:hideMark/>
           </w:tcPr>
@@ -13676,7 +13314,6 @@
         <w:tc>
           <w:tcPr>
             <w:tcW w:w="722" w:type="pct"/>
-            <w:shd w:val="clear" w:color="auto" w:fill="auto"/>
             <w:vAlign w:val="center"/>
             <w:hideMark/>
           </w:tcPr>
@@ -13705,7 +13342,6 @@
         <w:tc>
           <w:tcPr>
             <w:tcW w:w="722" w:type="pct"/>
-            <w:shd w:val="clear" w:color="auto" w:fill="auto"/>
             <w:vAlign w:val="center"/>
             <w:hideMark/>
           </w:tcPr>
@@ -13740,7 +13376,6 @@
           <w:tcPr>
             <w:tcW w:w="522" w:type="pct"/>
             <w:vMerge/>
-            <w:shd w:val="clear" w:color="auto" w:fill="auto"/>
             <w:vAlign w:val="center"/>
           </w:tcPr>
           <w:p>
@@ -13760,7 +13395,6 @@
           <w:tcPr>
             <w:tcW w:w="1253" w:type="pct"/>
             <w:vMerge/>
-            <w:shd w:val="clear" w:color="auto" w:fill="auto"/>
             <w:vAlign w:val="center"/>
           </w:tcPr>
           <w:p>
@@ -13780,7 +13414,6 @@
           <w:tcPr>
             <w:tcW w:w="853" w:type="pct"/>
             <w:vMerge/>
-            <w:shd w:val="clear" w:color="auto" w:fill="auto"/>
             <w:vAlign w:val="center"/>
           </w:tcPr>
           <w:p>
@@ -13799,7 +13432,6 @@
         <w:tc>
           <w:tcPr>
             <w:tcW w:w="928" w:type="pct"/>
-            <w:shd w:val="clear" w:color="auto" w:fill="auto"/>
             <w:vAlign w:val="center"/>
           </w:tcPr>
           <w:p>
@@ -13827,7 +13459,6 @@
         <w:tc>
           <w:tcPr>
             <w:tcW w:w="722" w:type="pct"/>
-            <w:shd w:val="clear" w:color="auto" w:fill="auto"/>
             <w:vAlign w:val="center"/>
           </w:tcPr>
           <w:p>
@@ -13855,7 +13486,6 @@
         <w:tc>
           <w:tcPr>
             <w:tcW w:w="722" w:type="pct"/>
-            <w:shd w:val="clear" w:color="auto" w:fill="auto"/>
             <w:vAlign w:val="center"/>
           </w:tcPr>
           <w:p>
@@ -13889,7 +13519,6 @@
           <w:tcPr>
             <w:tcW w:w="5000" w:type="pct"/>
             <w:gridSpan w:val="6"/>
-            <w:shd w:val="clear" w:color="000000" w:fill="004CAB"/>
             <w:vAlign w:val="center"/>
             <w:hideMark/>
           </w:tcPr>
@@ -13916,7 +13545,7 @@
                 <w:szCs w:val="20"/>
                 <w:lang w:val="es-CO" w:eastAsia="es-CO"/>
               </w:rPr>
-              <w:t xml:space="preserve">Descripción </w:t>
+              <w:t>Descripción </w:t>
             </w:r>
           </w:p>
         </w:tc>
@@ -13929,7 +13558,6 @@
           <w:tcPr>
             <w:tcW w:w="5000" w:type="pct"/>
             <w:gridSpan w:val="6"/>
-            <w:shd w:val="clear" w:color="auto" w:fill="auto"/>
             <w:vAlign w:val="center"/>
             <w:hideMark/>
           </w:tcPr>
@@ -13973,7 +13601,7 @@
                 <w:szCs w:val="20"/>
                 <w:lang w:val="es-CO" w:eastAsia="es-CO"/>
               </w:rPr>
-              <w:t xml:space="preserve"> inicial</w:t>
+              <w:t> inicial</w:t>
             </w:r>
           </w:p>
         </w:tc>
@@ -13985,7 +13613,6 @@
         <w:tc>
           <w:tcPr>
             <w:tcW w:w="522" w:type="pct"/>
-            <w:shd w:val="clear" w:color="000000" w:fill="004CAB"/>
             <w:vAlign w:val="center"/>
             <w:hideMark/>
           </w:tcPr>
@@ -13999,7 +13626,6 @@
                 <w:color w:val="FFFFFF"/>
                 <w:sz w:val="20"/>
                 <w:szCs w:val="20"/>
-                <w:highlight w:val="magenta"/>
                 <w:lang w:val="es-CO" w:eastAsia="es-CO"/>
               </w:rPr>
             </w:pPr>
@@ -14011,7 +13637,6 @@
                 <w:color w:val="FFFFFF"/>
                 <w:sz w:val="20"/>
                 <w:szCs w:val="20"/>
-                <w:highlight w:val="magenta"/>
                 <w:lang w:val="es-CO" w:eastAsia="es-CO"/>
               </w:rPr>
               <w:t>Versión</w:t>
@@ -14021,7 +13646,6 @@
         <w:tc>
           <w:tcPr>
             <w:tcW w:w="1253" w:type="pct"/>
-            <w:shd w:val="clear" w:color="000000" w:fill="004CAB"/>
             <w:vAlign w:val="center"/>
             <w:hideMark/>
           </w:tcPr>
@@ -14035,7 +13659,6 @@
                 <w:color w:val="FFFFFF"/>
                 <w:sz w:val="20"/>
                 <w:szCs w:val="20"/>
-                <w:highlight w:val="magenta"/>
                 <w:lang w:val="es-CO" w:eastAsia="es-CO"/>
               </w:rPr>
             </w:pPr>
@@ -14047,7 +13670,6 @@
                 <w:color w:val="FFFFFF"/>
                 <w:sz w:val="20"/>
                 <w:szCs w:val="20"/>
-                <w:highlight w:val="magenta"/>
                 <w:lang w:val="es-CO" w:eastAsia="es-CO"/>
               </w:rPr>
               <w:t>Identificación única del informe</w:t>
@@ -14057,7 +13679,6 @@
         <w:tc>
           <w:tcPr>
             <w:tcW w:w="853" w:type="pct"/>
-            <w:shd w:val="clear" w:color="000000" w:fill="004CAB"/>
             <w:vAlign w:val="center"/>
             <w:hideMark/>
           </w:tcPr>
@@ -14071,7 +13692,6 @@
                 <w:color w:val="FFFFFF"/>
                 <w:sz w:val="20"/>
                 <w:szCs w:val="20"/>
-                <w:highlight w:val="magenta"/>
                 <w:lang w:val="es-CO" w:eastAsia="es-CO"/>
               </w:rPr>
             </w:pPr>
@@ -14083,7 +13703,6 @@
                 <w:color w:val="FFFFFF"/>
                 <w:sz w:val="20"/>
                 <w:szCs w:val="20"/>
-                <w:highlight w:val="magenta"/>
                 <w:lang w:val="es-CO" w:eastAsia="es-CO"/>
               </w:rPr>
               <w:t>Fecha de emisión</w:t>
@@ -14093,7 +13712,6 @@
         <w:tc>
           <w:tcPr>
             <w:tcW w:w="928" w:type="pct"/>
-            <w:shd w:val="clear" w:color="000000" w:fill="004CAB"/>
             <w:vAlign w:val="center"/>
             <w:hideMark/>
           </w:tcPr>
@@ -14107,7 +13725,6 @@
                 <w:color w:val="FFFFFF"/>
                 <w:sz w:val="20"/>
                 <w:szCs w:val="20"/>
-                <w:highlight w:val="magenta"/>
                 <w:lang w:val="es-CO" w:eastAsia="es-CO"/>
               </w:rPr>
             </w:pPr>
@@ -14119,7 +13736,6 @@
                 <w:color w:val="FFFFFF"/>
                 <w:sz w:val="20"/>
                 <w:szCs w:val="20"/>
-                <w:highlight w:val="magenta"/>
                 <w:lang w:val="es-CO" w:eastAsia="es-CO"/>
               </w:rPr>
               <w:t>Elaborado</w:t>
@@ -14135,7 +13751,6 @@
                 <w:color w:val="FFFFFF"/>
                 <w:sz w:val="20"/>
                 <w:szCs w:val="20"/>
-                <w:highlight w:val="magenta"/>
                 <w:lang w:val="es-CO" w:eastAsia="es-CO"/>
               </w:rPr>
             </w:pPr>
@@ -14147,7 +13762,6 @@
                 <w:color w:val="FFFFFF"/>
                 <w:sz w:val="20"/>
                 <w:szCs w:val="20"/>
-                <w:highlight w:val="magenta"/>
                 <w:lang w:val="es-CO" w:eastAsia="es-CO"/>
               </w:rPr>
               <w:t>por</w:t>
@@ -14157,7 +13771,6 @@
         <w:tc>
           <w:tcPr>
             <w:tcW w:w="722" w:type="pct"/>
-            <w:shd w:val="clear" w:color="000000" w:fill="004CAB"/>
             <w:vAlign w:val="center"/>
             <w:hideMark/>
           </w:tcPr>
@@ -14171,7 +13784,6 @@
                 <w:color w:val="FFFFFF"/>
                 <w:sz w:val="20"/>
                 <w:szCs w:val="20"/>
-                <w:highlight w:val="magenta"/>
                 <w:lang w:val="es-CO" w:eastAsia="es-CO"/>
               </w:rPr>
             </w:pPr>
@@ -14183,7 +13795,6 @@
                 <w:color w:val="FFFFFF"/>
                 <w:sz w:val="20"/>
                 <w:szCs w:val="20"/>
-                <w:highlight w:val="magenta"/>
                 <w:lang w:val="es-CO" w:eastAsia="es-CO"/>
               </w:rPr>
               <w:t>Revisado por</w:t>
@@ -14193,7 +13804,6 @@
         <w:tc>
           <w:tcPr>
             <w:tcW w:w="722" w:type="pct"/>
-            <w:shd w:val="clear" w:color="000000" w:fill="004CAB"/>
             <w:vAlign w:val="center"/>
             <w:hideMark/>
           </w:tcPr>
@@ -14207,7 +13817,6 @@
                 <w:color w:val="FFFFFF"/>
                 <w:sz w:val="20"/>
                 <w:szCs w:val="20"/>
-                <w:highlight w:val="magenta"/>
                 <w:lang w:val="es-CO" w:eastAsia="es-CO"/>
               </w:rPr>
             </w:pPr>
@@ -14219,7 +13828,6 @@
                 <w:color w:val="FFFFFF"/>
                 <w:sz w:val="20"/>
                 <w:szCs w:val="20"/>
-                <w:highlight w:val="magenta"/>
                 <w:lang w:val="es-CO" w:eastAsia="es-CO"/>
               </w:rPr>
               <w:t>Aprobado por</w:t>
@@ -14235,7 +13843,6 @@
           <w:tcPr>
             <w:tcW w:w="522" w:type="pct"/>
             <w:vMerge w:val="restart"/>
-            <w:shd w:val="clear" w:color="auto" w:fill="auto"/>
             <w:vAlign w:val="center"/>
             <w:hideMark/>
           </w:tcPr>
@@ -14247,7 +13854,6 @@
                 <w:color w:val="484848"/>
                 <w:sz w:val="20"/>
                 <w:szCs w:val="20"/>
-                <w:highlight w:val="magenta"/>
                 <w:lang w:val="es-CO" w:eastAsia="es-CO"/>
               </w:rPr>
             </w:pPr>
@@ -14257,7 +13863,6 @@
                 <w:color w:val="484848"/>
                 <w:sz w:val="20"/>
                 <w:szCs w:val="20"/>
-                <w:highlight w:val="magenta"/>
                 <w:lang w:val="es-CO" w:eastAsia="es-CO"/>
               </w:rPr>
               <w:t>01</w:t>
@@ -14268,7 +13873,6 @@
           <w:tcPr>
             <w:tcW w:w="1253" w:type="pct"/>
             <w:vMerge w:val="restart"/>
-            <w:shd w:val="clear" w:color="auto" w:fill="auto"/>
             <w:vAlign w:val="center"/>
             <w:hideMark/>
           </w:tcPr>
@@ -14280,7 +13884,6 @@
                 <w:color w:val="484848"/>
                 <w:sz w:val="20"/>
                 <w:szCs w:val="20"/>
-                <w:highlight w:val="magenta"/>
                 <w:lang w:val="en-US" w:eastAsia="es-CO"/>
               </w:rPr>
             </w:pPr>
@@ -14290,7 +13893,6 @@
                 <w:color w:val="484848"/>
                 <w:sz w:val="20"/>
                 <w:szCs w:val="20"/>
-                <w:highlight w:val="magenta"/>
                 <w:lang w:val="en-US"/>
               </w:rPr>
               <w:t>OTXXXX-X-A-XXXX-V0</w:t>
@@ -14301,7 +13903,6 @@
                 <w:color w:val="484848"/>
                 <w:sz w:val="20"/>
                 <w:szCs w:val="20"/>
-                <w:highlight w:val="magenta"/>
                 <w:lang w:val="en-US"/>
               </w:rPr>
               <w:t>1</w:t>
@@ -14312,7 +13913,6 @@
           <w:tcPr>
             <w:tcW w:w="853" w:type="pct"/>
             <w:vMerge w:val="restart"/>
-            <w:shd w:val="clear" w:color="auto" w:fill="auto"/>
             <w:vAlign w:val="center"/>
             <w:hideMark/>
           </w:tcPr>
@@ -14324,7 +13924,6 @@
                 <w:color w:val="484848"/>
                 <w:sz w:val="20"/>
                 <w:szCs w:val="20"/>
-                <w:highlight w:val="magenta"/>
                 <w:lang w:val="es-CO" w:eastAsia="es-CO"/>
               </w:rPr>
             </w:pPr>
@@ -14334,7 +13933,6 @@
                 <w:color w:val="484848"/>
                 <w:sz w:val="20"/>
                 <w:szCs w:val="20"/>
-                <w:highlight w:val="magenta"/>
                 <w:lang w:val="es-CO" w:eastAsia="es-CO"/>
               </w:rPr>
               <w:t>DD/MM/AA</w:t>
@@ -14344,7 +13942,6 @@
         <w:tc>
           <w:tcPr>
             <w:tcW w:w="928" w:type="pct"/>
-            <w:shd w:val="clear" w:color="auto" w:fill="auto"/>
             <w:vAlign w:val="center"/>
           </w:tcPr>
           <w:p>
@@ -14355,7 +13952,6 @@
                 <w:color w:val="484848"/>
                 <w:sz w:val="20"/>
                 <w:szCs w:val="20"/>
-                <w:highlight w:val="magenta"/>
                 <w:lang w:val="es-CO" w:eastAsia="es-CO"/>
               </w:rPr>
             </w:pPr>
@@ -14365,7 +13961,6 @@
                 <w:color w:val="484848"/>
                 <w:sz w:val="20"/>
                 <w:szCs w:val="20"/>
-                <w:highlight w:val="magenta"/>
               </w:rPr>
               <w:t>FIRMA</w:t>
             </w:r>
@@ -14374,7 +13969,6 @@
         <w:tc>
           <w:tcPr>
             <w:tcW w:w="722" w:type="pct"/>
-            <w:shd w:val="clear" w:color="auto" w:fill="auto"/>
             <w:vAlign w:val="center"/>
           </w:tcPr>
           <w:p>
@@ -14385,7 +13979,6 @@
                 <w:color w:val="484848"/>
                 <w:sz w:val="20"/>
                 <w:szCs w:val="20"/>
-                <w:highlight w:val="magenta"/>
                 <w:lang w:val="es-CO" w:eastAsia="es-CO"/>
               </w:rPr>
             </w:pPr>
@@ -14395,7 +13988,6 @@
                 <w:color w:val="484848"/>
                 <w:sz w:val="20"/>
                 <w:szCs w:val="20"/>
-                <w:highlight w:val="magenta"/>
               </w:rPr>
               <w:t>FIRMA</w:t>
             </w:r>
@@ -14404,7 +13996,6 @@
         <w:tc>
           <w:tcPr>
             <w:tcW w:w="722" w:type="pct"/>
-            <w:shd w:val="clear" w:color="auto" w:fill="auto"/>
             <w:vAlign w:val="center"/>
           </w:tcPr>
           <w:p>
@@ -14415,7 +14006,6 @@
                 <w:color w:val="484848"/>
                 <w:sz w:val="20"/>
                 <w:szCs w:val="20"/>
-                <w:highlight w:val="magenta"/>
                 <w:lang w:val="es-CO" w:eastAsia="es-CO"/>
               </w:rPr>
             </w:pPr>
@@ -14425,7 +14015,6 @@
                 <w:color w:val="484848"/>
                 <w:sz w:val="20"/>
                 <w:szCs w:val="20"/>
-                <w:highlight w:val="magenta"/>
               </w:rPr>
               <w:t>FIRMA</w:t>
             </w:r>
@@ -14440,7 +14029,6 @@
           <w:tcPr>
             <w:tcW w:w="522" w:type="pct"/>
             <w:vMerge/>
-            <w:shd w:val="clear" w:color="auto" w:fill="auto"/>
             <w:vAlign w:val="center"/>
           </w:tcPr>
           <w:p>
@@ -14451,7 +14039,6 @@
                 <w:color w:val="484848"/>
                 <w:sz w:val="20"/>
                 <w:szCs w:val="20"/>
-                <w:highlight w:val="magenta"/>
                 <w:lang w:val="es-CO" w:eastAsia="es-CO"/>
               </w:rPr>
             </w:pPr>
@@ -14461,7 +14048,6 @@
           <w:tcPr>
             <w:tcW w:w="1253" w:type="pct"/>
             <w:vMerge/>
-            <w:shd w:val="clear" w:color="auto" w:fill="auto"/>
             <w:vAlign w:val="center"/>
           </w:tcPr>
           <w:p>
@@ -14472,7 +14058,6 @@
                 <w:color w:val="484848"/>
                 <w:sz w:val="20"/>
                 <w:szCs w:val="20"/>
-                <w:highlight w:val="magenta"/>
                 <w:lang w:val="es-CO" w:eastAsia="es-CO"/>
               </w:rPr>
             </w:pPr>
@@ -14482,7 +14067,6 @@
           <w:tcPr>
             <w:tcW w:w="853" w:type="pct"/>
             <w:vMerge/>
-            <w:shd w:val="clear" w:color="auto" w:fill="auto"/>
             <w:vAlign w:val="center"/>
           </w:tcPr>
           <w:p>
@@ -14493,7 +14077,6 @@
                 <w:color w:val="484848"/>
                 <w:sz w:val="20"/>
                 <w:szCs w:val="20"/>
-                <w:highlight w:val="magenta"/>
                 <w:lang w:val="es-CO" w:eastAsia="es-CO"/>
               </w:rPr>
             </w:pPr>
@@ -14502,7 +14085,6 @@
         <w:tc>
           <w:tcPr>
             <w:tcW w:w="928" w:type="pct"/>
-            <w:shd w:val="clear" w:color="auto" w:fill="auto"/>
             <w:vAlign w:val="center"/>
           </w:tcPr>
           <w:p>
@@ -14513,7 +14095,6 @@
                 <w:color w:val="484848"/>
                 <w:sz w:val="20"/>
                 <w:szCs w:val="20"/>
-                <w:highlight w:val="magenta"/>
                 <w:lang w:val="es-CO" w:eastAsia="es-CO"/>
               </w:rPr>
             </w:pPr>
@@ -14523,7 +14104,6 @@
                 <w:color w:val="484848"/>
                 <w:sz w:val="20"/>
                 <w:szCs w:val="20"/>
-                <w:highlight w:val="magenta"/>
               </w:rPr>
               <w:t>NOMBRE Y APELLIDO</w:t>
             </w:r>
@@ -14532,7 +14112,6 @@
         <w:tc>
           <w:tcPr>
             <w:tcW w:w="722" w:type="pct"/>
-            <w:shd w:val="clear" w:color="auto" w:fill="auto"/>
             <w:vAlign w:val="center"/>
           </w:tcPr>
           <w:p>
@@ -14543,7 +14122,6 @@
                 <w:color w:val="484848"/>
                 <w:sz w:val="20"/>
                 <w:szCs w:val="20"/>
-                <w:highlight w:val="magenta"/>
                 <w:lang w:val="es-CO" w:eastAsia="es-CO"/>
               </w:rPr>
             </w:pPr>
@@ -14553,7 +14131,6 @@
                 <w:color w:val="484848"/>
                 <w:sz w:val="20"/>
                 <w:szCs w:val="20"/>
-                <w:highlight w:val="magenta"/>
               </w:rPr>
               <w:t>NOMBRE Y APELLIDO</w:t>
             </w:r>
@@ -14562,7 +14139,6 @@
         <w:tc>
           <w:tcPr>
             <w:tcW w:w="722" w:type="pct"/>
-            <w:shd w:val="clear" w:color="auto" w:fill="auto"/>
             <w:vAlign w:val="center"/>
           </w:tcPr>
           <w:p>
@@ -14573,7 +14149,6 @@
                 <w:color w:val="484848"/>
                 <w:sz w:val="20"/>
                 <w:szCs w:val="20"/>
-                <w:highlight w:val="magenta"/>
                 <w:lang w:val="es-CO" w:eastAsia="es-CO"/>
               </w:rPr>
             </w:pPr>
@@ -14583,7 +14158,6 @@
                 <w:color w:val="484848"/>
                 <w:sz w:val="20"/>
                 <w:szCs w:val="20"/>
-                <w:highlight w:val="magenta"/>
               </w:rPr>
               <w:t>NOMBRE Y APELLIDO</w:t>
             </w:r>
@@ -14598,7 +14172,6 @@
           <w:tcPr>
             <w:tcW w:w="5000" w:type="pct"/>
             <w:gridSpan w:val="6"/>
-            <w:shd w:val="clear" w:color="000000" w:fill="004CAB"/>
             <w:vAlign w:val="center"/>
             <w:hideMark/>
           </w:tcPr>
@@ -14612,7 +14185,6 @@
                 <w:color w:val="FFFFFF"/>
                 <w:sz w:val="20"/>
                 <w:szCs w:val="20"/>
-                <w:highlight w:val="magenta"/>
                 <w:lang w:val="es-CO" w:eastAsia="es-CO"/>
               </w:rPr>
             </w:pPr>
@@ -14624,7 +14196,6 @@
                 <w:color w:val="FFFFFF"/>
                 <w:sz w:val="20"/>
                 <w:szCs w:val="20"/>
-                <w:highlight w:val="magenta"/>
                 <w:lang w:val="es-CO" w:eastAsia="es-CO"/>
               </w:rPr>
               <w:t>Descripción de la modificación</w:t>
@@ -14640,7 +14211,6 @@
           <w:tcPr>
             <w:tcW w:w="5000" w:type="pct"/>
             <w:gridSpan w:val="6"/>
-            <w:shd w:val="clear" w:color="auto" w:fill="auto"/>
             <w:vAlign w:val="center"/>
             <w:hideMark/>
           </w:tcPr>
@@ -14652,7 +14222,6 @@
                 <w:color w:val="484848"/>
                 <w:sz w:val="20"/>
                 <w:szCs w:val="20"/>
-                <w:highlight w:val="magenta"/>
                 <w:lang w:val="es-CO" w:eastAsia="es-CO"/>
               </w:rPr>
             </w:pPr>
@@ -14662,7 +14231,6 @@
                 <w:color w:val="484848"/>
                 <w:sz w:val="20"/>
                 <w:szCs w:val="20"/>
-                <w:highlight w:val="magenta"/>
                 <w:lang w:val="es-CO" w:eastAsia="es-CO"/>
               </w:rPr>
               <w:t>Se debe relacionar el motivo del porque se realiza el ajusta, quien lo solicita y específicamente que es lo ajustado.</w:t>
@@ -14694,7 +14262,7 @@
           <w:szCs w:val="20"/>
           <w:lang w:val="es-CO"/>
         </w:rPr>
-        <w:t xml:space="preserve">Fuente: SERAMBIENTE S.A.S., </w:t>
+        <w:t>Fuente: SERAMBIENTE S.A.S., </w:t>
       </w:r>
       <w:commentRangeStart w:id="144"/>
       <w:r>
@@ -14738,7 +14306,7 @@
           <w:szCs w:val="20"/>
           <w:lang w:val="es-CO"/>
         </w:rPr>
-        <w:t xml:space="preserve"> </w:t>
+        <w:t> </w:t>
       </w:r>
     </w:p>
     <w:p>
@@ -14757,7 +14325,6 @@
           <w:iCs/>
           <w:sz w:val="20"/>
           <w:szCs w:val="20"/>
-          <w:highlight w:val="cyan"/>
         </w:rPr>
       </w:pPr>
       <w:bookmarkStart w:id="145" w:name="_Hlk209170783"/>
@@ -14782,131 +14349,17 @@
         </w:rPr>
       </w:pPr>
     </w:p>
+    <w:bookmarkEnd w:id="145"/>
     <w:p>
       <w:pPr>
-        <w:widowControl w:val="0"/>
-        <w:tabs>
-          <w:tab w:val="left" w:pos="530"/>
-        </w:tabs>
-        <w:autoSpaceDE w:val="0"/>
-        <w:autoSpaceDN w:val="0"/>
-        <w:ind w:right="228"/>
-        <w:jc w:val="both"/>
+        <w:pStyle w:val="Sinespaciado"/>
+        <w:jc w:val="center"/>
         <w:rPr>
           <w:rFonts w:ascii="Avenir Next LT Pro" w:hAnsi="Avenir Next LT Pro"/>
           <w:i/>
-          <w:iCs/>
+          <w:color w:val="303030"/>
           <w:sz w:val="20"/>
           <w:szCs w:val="20"/>
-        </w:rPr>
-      </w:pPr>
-      <w:r>
-        <w:rPr>
-          <w:rFonts w:ascii="Avenir Next LT Pro" w:hAnsi="Avenir Next LT Pro"/>
-          <w:i/>
-          <w:iCs/>
-          <w:sz w:val="20"/>
-          <w:szCs w:val="20"/>
-        </w:rPr>
-        <w:t xml:space="preserve">Nota: Este documento corresponde a la modificación del </w:t>
-      </w:r>
-      <w:commentRangeStart w:id="146"/>
-      <w:r>
-        <w:rPr>
-          <w:rFonts w:ascii="Avenir Next LT Pro" w:hAnsi="Avenir Next LT Pro"/>
-          <w:i/>
-          <w:iCs/>
-          <w:sz w:val="20"/>
-          <w:szCs w:val="20"/>
-        </w:rPr>
-        <w:t xml:space="preserve">informe técnico de MATRIZ </w:t>
-      </w:r>
-      <w:proofErr w:type="gramStart"/>
-      <w:r>
-        <w:rPr>
-          <w:rFonts w:ascii="Avenir Next LT Pro" w:hAnsi="Avenir Next LT Pro"/>
-          <w:i/>
-          <w:iCs/>
-          <w:sz w:val="20"/>
-          <w:szCs w:val="20"/>
-        </w:rPr>
-        <w:t>XXX  OT</w:t>
-      </w:r>
-      <w:proofErr w:type="gramEnd"/>
-      <w:r>
-        <w:rPr>
-          <w:rFonts w:ascii="Avenir Next LT Pro" w:hAnsi="Avenir Next LT Pro"/>
-          <w:i/>
-          <w:iCs/>
-          <w:sz w:val="20"/>
-          <w:szCs w:val="20"/>
-        </w:rPr>
-        <w:t xml:space="preserve"> XXXX-X-A-XXXX-VXX</w:t>
-      </w:r>
-      <w:commentRangeEnd w:id="146"/>
-      <w:r>
-        <w:rPr>
-          <w:rFonts w:ascii="Avenir Next LT Pro" w:hAnsi="Avenir Next LT Pro"/>
-          <w:i/>
-          <w:iCs/>
-          <w:sz w:val="20"/>
-        </w:rPr>
-        <w:commentReference w:id="146"/>
-      </w:r>
-      <w:r>
-        <w:rPr>
-          <w:rFonts w:ascii="Avenir Next LT Pro" w:hAnsi="Avenir Next LT Pro"/>
-          <w:i/>
-          <w:iCs/>
-          <w:sz w:val="20"/>
-          <w:szCs w:val="20"/>
-        </w:rPr>
-        <w:t xml:space="preserve">, el cual ha sido anulado y reemplazado, bajo la nueva </w:t>
-      </w:r>
-      <w:commentRangeStart w:id="147"/>
-      <w:r>
-        <w:rPr>
-          <w:rFonts w:ascii="Avenir Next LT Pro" w:hAnsi="Avenir Next LT Pro"/>
-          <w:i/>
-          <w:iCs/>
-          <w:sz w:val="20"/>
-          <w:szCs w:val="20"/>
-        </w:rPr>
-        <w:t>identificación</w:t>
-      </w:r>
-      <w:commentRangeEnd w:id="147"/>
-      <w:r>
-        <w:rPr>
-          <w:rFonts w:ascii="Avenir Next LT Pro" w:hAnsi="Avenir Next LT Pro"/>
-          <w:i/>
-          <w:iCs/>
-          <w:sz w:val="20"/>
-        </w:rPr>
-        <w:commentReference w:id="147"/>
-      </w:r>
-      <w:r>
-        <w:rPr>
-          <w:rFonts w:ascii="Avenir Next LT Pro" w:hAnsi="Avenir Next LT Pro"/>
-          <w:i/>
-          <w:iCs/>
-          <w:sz w:val="20"/>
-          <w:szCs w:val="20"/>
-        </w:rPr>
-        <w:t xml:space="preserve"> OT XXXX-X-A-XXXX-VXX</w:t>
-      </w:r>
-    </w:p>
-    <w:bookmarkEnd w:id="145"/>
-    <w:p>
-      <w:pPr>
-        <w:pStyle w:val="Sinespaciado"/>
-        <w:jc w:val="center"/>
-        <w:rPr>
-          <w:rFonts w:ascii="Avenir Next LT Pro" w:hAnsi="Avenir Next LT Pro"/>
-          <w:i/>
-          <w:color w:val="303030"/>
-          <w:sz w:val="20"/>
-          <w:szCs w:val="20"/>
-          <w:highlight w:val="yellow"/>
           <w:lang w:val="es-ES_tradnl"/>
         </w:rPr>
       </w:pPr>
@@ -16098,7 +15551,6 @@
       <w:tc>
         <w:tcPr>
           <w:tcW w:w="2166" w:type="pct"/>
-          <w:shd w:val="clear" w:color="auto" w:fill="auto"/>
           <w:vAlign w:val="center"/>
         </w:tcPr>
         <w:p>
@@ -16131,7 +15583,7 @@
               <w:color w:val="303030"/>
               <w:sz w:val="20"/>
             </w:rPr>
-            <w:t xml:space="preserve"> </w:t>
+            <w:t> </w:t>
           </w:r>
           <w:r>
             <w:rPr>
@@ -16139,7 +15591,6 @@
               <w:b/>
               <w:color w:val="303030"/>
               <w:sz w:val="20"/>
-              <w:highlight w:val="cyan"/>
             </w:rPr>
             <w:t>{informe_tecnico_de_estudio_de_caracterizacion_de_a_1}</w:t>
           </w:r>
@@ -16149,7 +15600,6 @@
         <w:tcPr>
           <w:tcW w:w="1493" w:type="pct"/>
           <w:vMerge w:val="restart"/>
-          <w:shd w:val="clear" w:color="auto" w:fill="auto"/>
           <w:vAlign w:val="center"/>
         </w:tcPr>
         <w:p>
@@ -16203,7 +15653,7 @@
               <w:sz w:val="20"/>
               <w:lang w:val="es-ES_tradnl"/>
             </w:rPr>
-            <w:t xml:space="preserve"> formato</w:t>
+            <w:t> formato</w:t>
           </w:r>
           <w:r>
             <w:rPr>
@@ -16238,7 +15688,7 @@
               <w:color w:val="303030"/>
               <w:sz w:val="20"/>
             </w:rPr>
-            <w:t xml:space="preserve">Fecha: </w:t>
+            <w:t>Fecha: </w:t>
           </w:r>
           <w:r>
             <w:rPr>
@@ -16303,7 +15753,7 @@
               <w:color w:val="303030"/>
               <w:sz w:val="20"/>
             </w:rPr>
-            <w:t xml:space="preserve">Página </w:t>
+            <w:t>Página </w:t>
           </w:r>
           <w:r>
             <w:rPr>
@@ -16352,7 +15802,7 @@
               <w:color w:val="303030"/>
               <w:sz w:val="20"/>
             </w:rPr>
-            <w:t xml:space="preserve"> de </w:t>
+            <w:t> de </w:t>
           </w:r>
           <w:r>
             <w:rPr>
@@ -16429,7 +15879,6 @@
       <w:tc>
         <w:tcPr>
           <w:tcW w:w="2166" w:type="pct"/>
-          <w:shd w:val="clear" w:color="auto" w:fill="auto"/>
           <w:vAlign w:val="center"/>
         </w:tcPr>
         <w:p>
@@ -16439,7 +15888,6 @@
               <w:rFonts w:ascii="Avenir Next LT Pro" w:hAnsi="Avenir Next LT Pro" w:cs="Calibri"/>
               <w:color w:val="303030"/>
               <w:sz w:val="20"/>
-              <w:highlight w:val="cyan"/>
               <w:lang w:val="en-US"/>
             </w:rPr>
           </w:pPr>
@@ -16451,7 +15899,6 @@
               <w:color w:val="303030"/>
               <w:sz w:val="20"/>
               <w:szCs w:val="20"/>
-              <w:highlight w:val="cyan"/>
               <w:lang w:val="en-US"/>
             </w:rPr>
             <w:t>{var_20}</w:t>
@@ -16462,7 +15909,6 @@
               <w:color w:val="303030"/>
               <w:sz w:val="20"/>
               <w:szCs w:val="20"/>
-              <w:highlight w:val="cyan"/>
               <w:lang w:val="en-US"/>
             </w:rPr>
           </w:r>
@@ -16474,7 +15920,6 @@
               <w:color w:val="303030"/>
               <w:sz w:val="20"/>
               <w:szCs w:val="20"/>
-              <w:highlight w:val="cyan"/>
               <w:lang w:val="en-US"/>
             </w:rPr>
           </w:r>
@@ -16484,7 +15929,6 @@
               <w:color w:val="303030"/>
               <w:sz w:val="20"/>
               <w:szCs w:val="20"/>
-              <w:highlight w:val="cyan"/>
               <w:lang w:val="en-US"/>
             </w:rPr>
           </w:r>
@@ -16496,7 +15940,6 @@
               <w:color w:val="303030"/>
               <w:sz w:val="20"/>
               <w:szCs w:val="20"/>
-              <w:highlight w:val="cyan"/>
               <w:lang w:val="en-US"/>
             </w:rPr>
           </w:r>
@@ -16506,7 +15949,6 @@
               <w:color w:val="303030"/>
               <w:sz w:val="20"/>
               <w:szCs w:val="20"/>
-              <w:highlight w:val="cyan"/>
               <w:lang w:val="en-US"/>
             </w:rPr>
           </w:r>
@@ -16516,7 +15958,6 @@
         <w:tcPr>
           <w:tcW w:w="1493" w:type="pct"/>
           <w:vMerge/>
-          <w:shd w:val="clear" w:color="auto" w:fill="auto"/>
           <w:vAlign w:val="center"/>
         </w:tcPr>
         <w:p>

</xml_diff>

<commit_message>
fix(reports): reemplazar menciones literales de SERAMBIENTE por ALS ENVIRONMENTAL en 12 plantillas + fallback de datos
Texto fijo (fuera de tags {}) en word/document.xml y footers de las 12 plantillas
.docx que quedo sin actualizar en la sesion previa de retageo. Incluye variantes
con y sin punto final, texto fragmentado entre multiples nodos <w:t> por Word
(ej. "SERAMBIENTE S.A.S" + "." en runs separados) y un typo de origen
("SERAMBENTE"). Se dejo sin tocar el correo serambienteltda@hotmail.com en el
footer de 66-18/66-19 (dato de contacto real, no marca) para revision humana.

Ademas se corrigieron 8 valores de fallback hardcodeados en
templateDataMapper.ts (fuente SYSTEM, nombre de laboratorio, anexos) que
inyectaban "SERAMBIENTE S.A.S." en el render final incluso con las plantillas
ya corregidas -- confirmado end-to-end con test_full_pipeline.js sobre Suelos.

Co-Authored-By: Claude Sonnet 5 <noreply@anthropic.com>
</commit_message>
<xml_diff>
--- a/server/templates/reports/FO-PO-PSM-64-08 FORMATO PARA LA ELABORACIÓN DE INFORME TÉCNICO DE AGUA SUBTERRÁNEA-plantilla.docx
+++ b/server/templates/reports/FO-PO-PSM-64-08 FORMATO PARA LA ELABORACIÓN DE INFORME TÉCNICO DE AGUA SUBTERRÁNEA-plantilla.docx
@@ -5022,7 +5022,7 @@
           <w:szCs w:val="22"/>
           <w:lang w:val="es-ES"/>
         </w:rPr>
-        <w:t>SERAMBIENTE S.A.S.</w:t>
+        <w:t>ALS ENVIRONMENTAL S.A.S.</w:t>
       </w:r>
       <w:r>
         <w:rPr>
@@ -5682,7 +5682,7 @@
           <w:sz w:val="20"/>
           <w:lang w:val="es-CO"/>
         </w:rPr>
-        <w:t>SERAMBIENTE S.A.S</w:t>
+        <w:t>ALS ENVIRONMENTAL S.A.S.</w:t>
       </w:r>
       <w:commentRangeEnd w:id="57"/>
       <w:r>
@@ -5702,7 +5702,7 @@
           <w:sz w:val="20"/>
           <w:lang w:val="es-CO"/>
         </w:rPr>
-        <w:t>., </w:t>
+        <w:t>, </w:t>
       </w:r>
       <w:commentRangeStart w:id="58"/>
       <w:r>
@@ -6145,7 +6145,7 @@
           <w:szCs w:val="20"/>
           <w:lang w:val="es-CO"/>
         </w:rPr>
-        <w:t>Fuente: SERAMBIENTE S.A.S., {tag_year}</w:t>
+        <w:t>Fuente: ALS ENVIRONMENTAL S.A.S., {tag_year}</w:t>
       </w:r>
       <w:r>
         <w:rPr>
@@ -6815,7 +6815,7 @@
           <w:sz w:val="20"/>
           <w:lang w:val="es-CO"/>
         </w:rPr>
-        <w:t>SERAMBIENTE S.A.S</w:t>
+        <w:t>ALS ENVIRONMENTAL S.A.S.</w:t>
       </w:r>
       <w:commentRangeEnd w:id="70"/>
       <w:r>
@@ -6835,7 +6835,7 @@
           <w:sz w:val="20"/>
           <w:lang w:val="es-CO"/>
         </w:rPr>
-        <w:t>., </w:t>
+        <w:t>, </w:t>
       </w:r>
       <w:commentRangeStart w:id="71"/>
       <w:r>
@@ -8511,7 +8511,7 @@
           <w:szCs w:val="20"/>
           <w:lang w:val="es-CO"/>
         </w:rPr>
-        <w:t>Fuente: SERAMBIENTE S.A.S., </w:t>
+        <w:t>Fuente: ALS ENVIRONMENTAL S.A.S., </w:t>
       </w:r>
       <w:commentRangeStart w:id="100"/>
       <w:r>
@@ -10336,7 +10336,7 @@
           <w:color w:val="303030"/>
           <w:lang w:val="es-CO"/>
         </w:rPr>
-        <w:t>Fuente: SERAMBIENTE S.A.S., </w:t>
+        <w:t>Fuente: ALS ENVIRONMENTAL S.A.S., </w:t>
       </w:r>
       <w:commentRangeStart w:id="108"/>
       <w:r>
@@ -10952,7 +10952,7 @@
           <w:color w:val="303030"/>
           <w:lang w:val="es-CO"/>
         </w:rPr>
-        <w:t>SERAMBIENTE S.A.S.</w:t>
+        <w:t>ALS ENVIRONMENTAL S.A.S.</w:t>
       </w:r>
       <w:r>
         <w:rPr>
@@ -11103,7 +11103,7 @@
           <w:szCs w:val="16"/>
           <w:lang w:val="es-CO"/>
         </w:rPr>
-        <w:t>INFORME VÁLIDO ÚNICAMENTE PARA LA(S) MUESTRA(S) ANALIZADA(S). LA REPRODUCCIÓN PARCIAL O TOTAL DEL PRESENTE INFORME DEBE HACERSE CON AUTORIZACIÓN EXPRESA DE SERAMBIENTE S.A.S. CUALQUIER TIPO DE OBSERVACIÓN REQUERIDA POR EL CLIENTE Y RELACIONADA CON LOS RESULTADOS EMITIDOS, SÓLO SERÁ ACEPTADA DENTRO DE LOS </w:t>
+        <w:t>INFORME VÁLIDO ÚNICAMENTE PARA LA(S) MUESTRA(S) ANALIZADA(S). LA REPRODUCCIÓN PARCIAL O TOTAL DEL PRESENTE INFORME DEBE HACERSE CON AUTORIZACIÓN EXPRESA DE ALS ENVIRONMENTAL S.A.S. CUALQUIER TIPO DE OBSERVACIÓN REQUERIDA POR EL CLIENTE Y RELACIONADA CON LOS RESULTADOS EMITIDOS, SÓLO SERÁ ACEPTADA DENTRO DE LOS </w:t>
       </w:r>
       <w:r>
         <w:rPr>
@@ -12695,7 +12695,7 @@
           <w:szCs w:val="20"/>
           <w:lang w:val="es-CO"/>
         </w:rPr>
-        <w:t>Fuente: SERAMBIENTE S.A.S., </w:t>
+        <w:t>Fuente: ALS ENVIRONMENTAL S.A.S., </w:t>
       </w:r>
       <w:commentRangeStart w:id="133"/>
       <w:r>
@@ -14262,7 +14262,7 @@
           <w:szCs w:val="20"/>
           <w:lang w:val="es-CO"/>
         </w:rPr>
-        <w:t>Fuente: SERAMBIENTE S.A.S., </w:t>
+        <w:t>Fuente: ALS ENVIRONMENTAL S.A.S., </w:t>
       </w:r>
       <w:commentRangeStart w:id="144"/>
       <w:r>

</xml_diff>